<commit_message>
6.13 Finish ALL Project Development for Preliminary Presentation
</commit_message>
<xml_diff>
--- a/Project 1.docx
+++ b/Project 1.docx
@@ -12231,7 +12231,7 @@
     <w:p>
       <w:pPr>
         <w:rPr>
-          <w:rFonts w:eastAsia="SimSun" w:hint="eastAsia"/>
+          <w:rFonts w:eastAsia="SimSun"/>
           <w:lang w:val="en-US"/>
         </w:rPr>
       </w:pPr>
@@ -12560,24 +12560,6 @@
           <w:lang w:val="en-US"/>
         </w:rPr>
       </w:pPr>
-    </w:p>
-    <w:p>
-      <w:pPr>
-        <w:spacing w:after="160" w:line="278" w:lineRule="auto"/>
-        <w:rPr>
-          <w:rFonts w:asciiTheme="majorHAnsi" w:eastAsiaTheme="majorEastAsia" w:hAnsiTheme="majorHAnsi" w:cstheme="majorBidi" w:hint="eastAsia"/>
-          <w:color w:val="0F4761" w:themeColor="accent1" w:themeShade="BF"/>
-          <w:sz w:val="40"/>
-          <w:szCs w:val="40"/>
-          <w:lang w:val="en-US"/>
-        </w:rPr>
-      </w:pPr>
-      <w:r>
-        <w:rPr>
-          <w:lang w:val="en-US"/>
-        </w:rPr>
-        <w:br w:type="page"/>
-      </w:r>
     </w:p>
     <w:p>
       <w:pPr>
@@ -12594,6 +12576,24 @@
         <w:rPr>
           <w:lang w:val="en-US"/>
         </w:rPr>
+        <w:br w:type="page"/>
+      </w:r>
+    </w:p>
+    <w:p>
+      <w:pPr>
+        <w:spacing w:after="160" w:line="278" w:lineRule="auto"/>
+        <w:rPr>
+          <w:rFonts w:asciiTheme="majorHAnsi" w:eastAsiaTheme="majorEastAsia" w:hAnsiTheme="majorHAnsi" w:cstheme="majorBidi"/>
+          <w:color w:val="0F4761" w:themeColor="accent1" w:themeShade="BF"/>
+          <w:sz w:val="40"/>
+          <w:szCs w:val="40"/>
+          <w:lang w:val="en-US"/>
+        </w:rPr>
+      </w:pPr>
+      <w:r>
+        <w:rPr>
+          <w:lang w:val="en-US"/>
+        </w:rPr>
         <w:lastRenderedPageBreak/>
         <w:br w:type="page"/>
       </w:r>
@@ -12632,17 +12632,17 @@
     <w:p>
       <w:pPr>
         <w:rPr>
-          <w:rFonts w:hint="eastAsia"/>
-          <w:lang w:val="en-US"/>
-        </w:rPr>
-      </w:pPr>
-    </w:p>
-    <w:p>
-      <w:pPr>
-        <w:rPr>
-          <w:rFonts w:ascii="SimSun" w:eastAsia="SimSun" w:hAnsi="SimSun" w:cs="SimSun"/>
-        </w:rPr>
-      </w:pPr>
+          <w:lang w:val="en-US"/>
+        </w:rPr>
+      </w:pPr>
+    </w:p>
+    <w:p>
+      <w:pPr>
+        <w:rPr>
+          <w:rFonts w:ascii="SimSun" w:eastAsia="SimSun" w:hAnsi="SimSun" w:cs="SimSun"/>
+        </w:rPr>
+      </w:pPr>
+      <w:bookmarkStart w:id="3" w:name="OLE_LINK7"/>
       <w:r>
         <w:rPr>
           <w:rFonts w:ascii="SimSun" w:eastAsia="SimSun" w:hAnsi="SimSun" w:cs="SimSun"/>
@@ -12650,14 +12650,14 @@
         </w:rPr>
         <w:t xml:space="preserve">Question1: </w:t>
       </w:r>
-      <w:bookmarkStart w:id="3" w:name="OLE_LINK4"/>
+      <w:bookmarkStart w:id="4" w:name="OLE_LINK4"/>
       <w:r>
         <w:rPr>
           <w:rFonts w:ascii="SimSun" w:eastAsia="SimSun" w:hAnsi="SimSun" w:cs="SimSun" w:hint="eastAsia"/>
         </w:rPr>
         <w:t>帮我查询今天北京市的实时气温、风力和天气状况。</w:t>
       </w:r>
-      <w:bookmarkEnd w:id="3"/>
+      <w:bookmarkEnd w:id="4"/>
     </w:p>
     <w:p>
       <w:pPr>
@@ -12671,14 +12671,14 @@
         </w:rPr>
         <w:t>Question2:</w:t>
       </w:r>
-      <w:bookmarkStart w:id="4" w:name="OLE_LINK6"/>
+      <w:bookmarkStart w:id="5" w:name="OLE_LINK6"/>
       <w:r>
         <w:rPr>
           <w:rFonts w:ascii="SimSun" w:eastAsia="SimSun" w:hAnsi="SimSun" w:cs="SimSun" w:hint="eastAsia"/>
         </w:rPr>
         <w:t>依次查询上海、广州、成都、哈尔滨这四座城市明天一整天的天气，并分城市列出结果。</w:t>
       </w:r>
-      <w:bookmarkEnd w:id="4"/>
+      <w:bookmarkEnd w:id="5"/>
     </w:p>
     <w:p>
       <w:pPr>
@@ -12741,7 +12741,7 @@
         </w:rPr>
         <w:t>Question5:</w:t>
       </w:r>
-      <w:bookmarkStart w:id="5" w:name="OLE_LINK3"/>
+      <w:bookmarkStart w:id="6" w:name="OLE_LINK3"/>
       <w:r>
         <w:rPr>
           <w:rFonts w:ascii="SimSun" w:eastAsia="SimSun" w:hAnsi="SimSun" w:cs="SimSun" w:hint="eastAsia"/>
@@ -12749,24 +12749,37 @@
         <w:t>对比一下西安和昆明本周的天气差异，重点对比气温和降雨情况。</w:t>
       </w:r>
     </w:p>
-    <w:p>
-      <w:pPr>
-        <w:rPr>
-          <w:rFonts w:ascii="SimSun" w:eastAsia="SimSun" w:hAnsi="SimSun" w:cs="SimSun"/>
-        </w:rPr>
-      </w:pPr>
-    </w:p>
-    <w:p>
-      <w:pPr>
-        <w:rPr>
-          <w:rFonts w:ascii="SimSun" w:eastAsia="SimSun" w:hAnsi="SimSun" w:cs="SimSun"/>
-        </w:rPr>
-      </w:pPr>
-      <w:r>
-        <w:rPr>
-          <w:rFonts w:ascii="SimSun" w:eastAsia="SimSun" w:hAnsi="SimSun" w:cs="SimSun" w:hint="eastAsia"/>
-        </w:rPr>
-        <w:t>[问题]:</w:t>
+    <w:bookmarkEnd w:id="3"/>
+    <w:p>
+      <w:pPr>
+        <w:rPr>
+          <w:rFonts w:ascii="SimSun" w:eastAsia="SimSun" w:hAnsi="SimSun" w:cs="SimSun"/>
+        </w:rPr>
+      </w:pPr>
+    </w:p>
+    <w:p>
+      <w:pPr>
+        <w:rPr>
+          <w:rFonts w:ascii="SimSun" w:eastAsia="SimSun" w:hAnsi="SimSun" w:cs="SimSun"/>
+        </w:rPr>
+      </w:pPr>
+      <w:r>
+        <w:rPr>
+          <w:rFonts w:ascii="SimSun" w:eastAsia="SimSun" w:hAnsi="SimSun" w:cs="SimSun" w:hint="eastAsia"/>
+        </w:rPr>
+        <w:t>[问题</w:t>
+      </w:r>
+      <w:r>
+        <w:rPr>
+          <w:rFonts w:ascii="SimSun" w:eastAsia="SimSun" w:hAnsi="SimSun" w:cs="SimSun" w:hint="eastAsia"/>
+        </w:rPr>
+        <w:t>1</w:t>
+      </w:r>
+      <w:r>
+        <w:rPr>
+          <w:rFonts w:ascii="SimSun" w:eastAsia="SimSun" w:hAnsi="SimSun" w:cs="SimSun" w:hint="eastAsia"/>
+        </w:rPr>
+        <w:t>]:</w:t>
       </w:r>
     </w:p>
     <w:p>
@@ -12783,11 +12796,6 @@
       </w:r>
     </w:p>
     <w:p>
-      <w:pPr>
-        <w:rPr>
-          <w:rFonts w:hint="eastAsia"/>
-        </w:rPr>
-      </w:pPr>
       <w:r>
         <w:rPr>
           <w:rFonts w:ascii="SimSun" w:eastAsia="SimSun" w:hAnsi="SimSun" w:cs="SimSun" w:hint="eastAsia"/>
@@ -12919,7 +12927,7 @@
     <w:p>
       <w:pPr>
         <w:rPr>
-          <w:rFonts w:hint="eastAsia"/>
+          <w:rFonts w:ascii="SimSun" w:eastAsia="SimSun" w:hAnsi="SimSun" w:cs="SimSun"/>
         </w:rPr>
       </w:pPr>
       <w:r>
@@ -12929,17 +12937,3794 @@
         <w:t>后来增加了多轮工具调用的程序段 用for 循环多次调用Tool 把一个问题中多个城市都查询</w:t>
       </w:r>
     </w:p>
-    <w:bookmarkEnd w:id="5"/>
-    <w:p>
-      <w:pPr>
-        <w:rPr>
-          <w:rFonts w:eastAsia="SimSun"/>
-          <w:lang w:val="en-US"/>
-        </w:rPr>
-      </w:pPr>
-      <w:r>
-        <w:rPr>
-          <w:rFonts w:eastAsia="SimSun" w:hint="eastAsia"/>
+    <w:p>
+      <w:pPr>
+        <w:rPr>
+          <w:rFonts w:ascii="SimSun" w:eastAsia="SimSun" w:hAnsi="SimSun" w:cs="SimSun"/>
+        </w:rPr>
+      </w:pPr>
+    </w:p>
+    <w:p>
+      <w:pPr>
+        <w:rPr>
+          <w:rFonts w:ascii="SimSun" w:eastAsia="SimSun" w:hAnsi="SimSun" w:cs="SimSun"/>
+          <w:b/>
+          <w:bCs/>
+          <w:lang w:val="en-US"/>
+        </w:rPr>
+      </w:pPr>
+      <w:r>
+        <w:rPr>
+          <w:rFonts w:ascii="SimSun" w:eastAsia="SimSun" w:hAnsi="SimSun" w:cs="SimSun" w:hint="eastAsia"/>
+          <w:b/>
+          <w:bCs/>
+        </w:rPr>
+        <w:t xml:space="preserve">我的疑问: </w:t>
+      </w:r>
+      <w:r>
+        <w:rPr>
+          <w:rFonts w:ascii="SimSun" w:eastAsia="SimSun" w:hAnsi="SimSun" w:cs="SimSun"/>
+          <w:b/>
+          <w:bCs/>
+          <w:lang w:val="en-US"/>
+        </w:rPr>
+        <w:t xml:space="preserve">temperature </w:t>
+      </w:r>
+      <w:r>
+        <w:rPr>
+          <w:rFonts w:ascii="SimSun" w:eastAsia="SimSun" w:hAnsi="SimSun" w:cs="SimSun" w:hint="eastAsia"/>
+          <w:b/>
+          <w:bCs/>
+          <w:lang w:val="en-US"/>
+        </w:rPr>
+        <w:t>的作用在think mode下的区别更大还是在非think mode下的作用更大</w:t>
+      </w:r>
+    </w:p>
+    <w:p>
+      <w:pPr>
+        <w:rPr>
+          <w:rFonts w:ascii="SimSun" w:eastAsia="SimSun" w:hAnsi="SimSun" w:cs="SimSun"/>
+          <w:lang w:val="en-US"/>
+        </w:rPr>
+      </w:pPr>
+      <w:r>
+        <w:rPr>
+          <w:rFonts w:ascii="SimSun" w:eastAsia="SimSun" w:hAnsi="SimSun" w:cs="SimSun" w:hint="eastAsia"/>
+          <w:lang w:val="en-US"/>
+        </w:rPr>
+        <w:t>豆包:</w:t>
+      </w:r>
+    </w:p>
+    <w:p>
+      <w:pPr>
+        <w:rPr>
+          <w:lang w:val="en-US"/>
+        </w:rPr>
+      </w:pPr>
+      <w:r>
+        <w:rPr>
+          <w:rFonts w:ascii="SimSun" w:eastAsia="SimSun" w:hAnsi="SimSun" w:cs="SimSun" w:hint="eastAsia"/>
+          <w:lang w:val="en-US"/>
+        </w:rPr>
+        <w:t>结论先说：</w:t>
+      </w:r>
+      <w:r>
+        <w:rPr>
+          <w:lang w:val="en-US"/>
+        </w:rPr>
+        <w:t xml:space="preserve">temperature </w:t>
+      </w:r>
+      <w:r>
+        <w:rPr>
+          <w:rFonts w:ascii="SimSun" w:eastAsia="SimSun" w:hAnsi="SimSun" w:cs="SimSun" w:hint="eastAsia"/>
+          <w:lang w:val="en-US"/>
+        </w:rPr>
+        <w:t>在非思考模式下影响更大、更敏感；在思考模式下影响更小、更温和。下面把原因、表现、调参建议讲清楚。</w:t>
+      </w:r>
+    </w:p>
+    <w:p>
+      <w:pPr>
+        <w:rPr>
+          <w:lang w:val="en-US"/>
+        </w:rPr>
+      </w:pPr>
+      <w:r>
+        <w:rPr>
+          <w:rFonts w:ascii="SimSun" w:eastAsia="SimSun" w:hAnsi="SimSun" w:cs="SimSun" w:hint="eastAsia"/>
+          <w:lang w:val="en-US"/>
+        </w:rPr>
+        <w:t>一、为什么非思考模式更敏感？</w:t>
+      </w:r>
+    </w:p>
+    <w:p>
+      <w:pPr>
+        <w:rPr>
+          <w:lang w:val="en-US"/>
+        </w:rPr>
+      </w:pPr>
+      <w:r>
+        <w:rPr>
+          <w:lang w:val="en-US"/>
+        </w:rPr>
+        <w:t xml:space="preserve">1. </w:t>
+      </w:r>
+      <w:r>
+        <w:rPr>
+          <w:rFonts w:ascii="SimSun" w:eastAsia="SimSun" w:hAnsi="SimSun" w:cs="SimSun" w:hint="eastAsia"/>
+          <w:lang w:val="en-US"/>
+        </w:rPr>
+        <w:t>生成结构不一样</w:t>
+      </w:r>
+    </w:p>
+    <w:p>
+      <w:pPr>
+        <w:rPr>
+          <w:lang w:val="en-US"/>
+        </w:rPr>
+      </w:pPr>
+      <w:r>
+        <w:rPr>
+          <w:rFonts w:ascii="SimSun" w:eastAsia="SimSun" w:hAnsi="SimSun" w:cs="SimSun" w:hint="eastAsia"/>
+          <w:lang w:val="en-US"/>
+        </w:rPr>
+        <w:t>非思考模式（</w:t>
+      </w:r>
+      <w:proofErr w:type="spellStart"/>
+      <w:r>
+        <w:rPr>
+          <w:lang w:val="en-US"/>
+        </w:rPr>
+        <w:t>no_think</w:t>
+      </w:r>
+      <w:proofErr w:type="spellEnd"/>
+      <w:r>
+        <w:rPr>
+          <w:rFonts w:ascii="SimSun" w:eastAsia="SimSun" w:hAnsi="SimSun" w:cs="SimSun" w:hint="eastAsia"/>
+          <w:lang w:val="en-US"/>
+        </w:rPr>
+        <w:t>）：只生成一段最终答案，</w:t>
+      </w:r>
+      <w:r>
+        <w:rPr>
+          <w:lang w:val="en-US"/>
+        </w:rPr>
+        <w:t xml:space="preserve">temperature </w:t>
+      </w:r>
+      <w:r>
+        <w:rPr>
+          <w:rFonts w:ascii="SimSun" w:eastAsia="SimSun" w:hAnsi="SimSun" w:cs="SimSun" w:hint="eastAsia"/>
+          <w:lang w:val="en-US"/>
+        </w:rPr>
+        <w:t>直接作用在唯一的解码链上，随机度</w:t>
+      </w:r>
+      <w:r>
+        <w:rPr>
+          <w:lang w:val="en-US"/>
+        </w:rPr>
+        <w:t xml:space="preserve"> “</w:t>
+      </w:r>
+      <w:r>
+        <w:rPr>
+          <w:rFonts w:ascii="SimSun" w:eastAsia="SimSun" w:hAnsi="SimSun" w:cs="SimSun" w:hint="eastAsia"/>
+          <w:lang w:val="en-US"/>
+        </w:rPr>
+        <w:t>一步到位</w:t>
+      </w:r>
+      <w:r>
+        <w:rPr>
+          <w:rFonts w:hint="eastAsia"/>
+          <w:lang w:val="en-US"/>
+        </w:rPr>
+        <w:t>”</w:t>
+      </w:r>
+      <w:r>
+        <w:rPr>
+          <w:rFonts w:ascii="SimSun" w:eastAsia="SimSun" w:hAnsi="SimSun" w:cs="SimSun" w:hint="eastAsia"/>
+          <w:lang w:val="en-US"/>
+        </w:rPr>
+        <w:t>。</w:t>
+      </w:r>
+    </w:p>
+    <w:p>
+      <w:pPr>
+        <w:rPr>
+          <w:b/>
+          <w:bCs/>
+          <w:lang w:val="en-US"/>
+        </w:rPr>
+      </w:pPr>
+      <w:bookmarkStart w:id="7" w:name="OLE_LINK8"/>
+      <w:r>
+        <w:rPr>
+          <w:rFonts w:ascii="SimSun" w:eastAsia="SimSun" w:hAnsi="SimSun" w:cs="SimSun" w:hint="eastAsia"/>
+          <w:lang w:val="en-US"/>
+        </w:rPr>
+        <w:t>思考模式（</w:t>
+      </w:r>
+      <w:r>
+        <w:rPr>
+          <w:lang w:val="en-US"/>
+        </w:rPr>
+        <w:t>think</w:t>
+      </w:r>
+      <w:r>
+        <w:rPr>
+          <w:rFonts w:ascii="SimSun" w:eastAsia="SimSun" w:hAnsi="SimSun" w:cs="SimSun" w:hint="eastAsia"/>
+          <w:lang w:val="en-US"/>
+        </w:rPr>
+        <w:t>）：生成两段内容</w:t>
+      </w:r>
+      <w:r>
+        <w:rPr>
+          <w:rFonts w:hint="eastAsia"/>
+          <w:lang w:val="en-US"/>
+        </w:rPr>
+        <w:t>——</w:t>
+      </w:r>
+      <w:r>
+        <w:rPr>
+          <w:lang w:val="en-US"/>
+        </w:rPr>
+        <w:t xml:space="preserve"> </w:t>
+      </w:r>
+      <w:r>
+        <w:rPr>
+          <w:rFonts w:ascii="SimSun" w:eastAsia="SimSun" w:hAnsi="SimSun" w:cs="SimSun" w:hint="eastAsia"/>
+          <w:lang w:val="en-US"/>
+        </w:rPr>
+        <w:t>先内部推理（思考链），再输出答案。</w:t>
+      </w:r>
+      <w:r>
+        <w:rPr>
+          <w:lang w:val="en-US"/>
+        </w:rPr>
+        <w:t xml:space="preserve">temperature </w:t>
+      </w:r>
+      <w:r>
+        <w:rPr>
+          <w:rFonts w:ascii="SimSun" w:eastAsia="SimSun" w:hAnsi="SimSun" w:cs="SimSun" w:hint="eastAsia"/>
+          <w:lang w:val="en-US"/>
+        </w:rPr>
+        <w:t>同时影响推理</w:t>
+      </w:r>
+      <w:r>
+        <w:rPr>
+          <w:lang w:val="en-US"/>
+        </w:rPr>
+        <w:t xml:space="preserve"> + </w:t>
+      </w:r>
+      <w:r>
+        <w:rPr>
+          <w:rFonts w:ascii="SimSun" w:eastAsia="SimSun" w:hAnsi="SimSun" w:cs="SimSun" w:hint="eastAsia"/>
+          <w:lang w:val="en-US"/>
+        </w:rPr>
+        <w:t>答案，</w:t>
+      </w:r>
+      <w:r>
+        <w:rPr>
+          <w:rFonts w:ascii="SimSun" w:eastAsia="SimSun" w:hAnsi="SimSun" w:cs="SimSun" w:hint="eastAsia"/>
+          <w:b/>
+          <w:bCs/>
+          <w:lang w:val="en-US"/>
+        </w:rPr>
+        <w:t>但推理过程本身会约束随机性，把</w:t>
+      </w:r>
+      <w:r>
+        <w:rPr>
+          <w:b/>
+          <w:bCs/>
+          <w:lang w:val="en-US"/>
+        </w:rPr>
+        <w:t xml:space="preserve"> “</w:t>
+      </w:r>
+      <w:r>
+        <w:rPr>
+          <w:rFonts w:ascii="SimSun" w:eastAsia="SimSun" w:hAnsi="SimSun" w:cs="SimSun" w:hint="eastAsia"/>
+          <w:b/>
+          <w:bCs/>
+          <w:lang w:val="en-US"/>
+        </w:rPr>
+        <w:t>发散</w:t>
+      </w:r>
+      <w:r>
+        <w:rPr>
+          <w:rFonts w:hint="eastAsia"/>
+          <w:b/>
+          <w:bCs/>
+          <w:lang w:val="en-US"/>
+        </w:rPr>
+        <w:t>”</w:t>
+      </w:r>
+      <w:r>
+        <w:rPr>
+          <w:b/>
+          <w:bCs/>
+          <w:lang w:val="en-US"/>
+        </w:rPr>
+        <w:t xml:space="preserve"> </w:t>
+      </w:r>
+      <w:r>
+        <w:rPr>
+          <w:rFonts w:ascii="SimSun" w:eastAsia="SimSun" w:hAnsi="SimSun" w:cs="SimSun" w:hint="eastAsia"/>
+          <w:b/>
+          <w:bCs/>
+          <w:lang w:val="en-US"/>
+        </w:rPr>
+        <w:t>拉回逻辑轨道。</w:t>
+      </w:r>
+    </w:p>
+    <w:bookmarkEnd w:id="7"/>
+    <w:p>
+      <w:pPr>
+        <w:rPr>
+          <w:lang w:val="en-US"/>
+        </w:rPr>
+      </w:pPr>
+      <w:r>
+        <w:rPr>
+          <w:lang w:val="en-US"/>
+        </w:rPr>
+        <w:t xml:space="preserve">2. </w:t>
+      </w:r>
+      <w:r>
+        <w:rPr>
+          <w:rFonts w:ascii="SimSun" w:eastAsia="SimSun" w:hAnsi="SimSun" w:cs="SimSun" w:hint="eastAsia"/>
+          <w:lang w:val="en-US"/>
+        </w:rPr>
+        <w:t>解码策略差异（以</w:t>
+      </w:r>
+      <w:r>
+        <w:rPr>
+          <w:lang w:val="en-US"/>
+        </w:rPr>
+        <w:t xml:space="preserve"> Qwen3 </w:t>
+      </w:r>
+      <w:r>
+        <w:rPr>
+          <w:rFonts w:ascii="SimSun" w:eastAsia="SimSun" w:hAnsi="SimSun" w:cs="SimSun" w:hint="eastAsia"/>
+          <w:lang w:val="en-US"/>
+        </w:rPr>
+        <w:t>等主流模型为例）</w:t>
+      </w:r>
+    </w:p>
+    <w:p>
+      <w:pPr>
+        <w:rPr>
+          <w:lang w:val="en-US"/>
+        </w:rPr>
+      </w:pPr>
+      <w:proofErr w:type="spellStart"/>
+      <w:r>
+        <w:rPr>
+          <w:lang w:val="en-US"/>
+        </w:rPr>
+        <w:t>no_think</w:t>
+      </w:r>
+      <w:proofErr w:type="spellEnd"/>
+      <w:r>
+        <w:rPr>
+          <w:rFonts w:ascii="SimSun" w:eastAsia="SimSun" w:hAnsi="SimSun" w:cs="SimSun" w:hint="eastAsia"/>
+          <w:lang w:val="en-US"/>
+        </w:rPr>
+        <w:t>：默认</w:t>
+      </w:r>
+      <w:r>
+        <w:rPr>
+          <w:lang w:val="en-US"/>
+        </w:rPr>
+        <w:t xml:space="preserve"> T=0.7</w:t>
+      </w:r>
+      <w:r>
+        <w:rPr>
+          <w:rFonts w:ascii="SimSun" w:eastAsia="SimSun" w:hAnsi="SimSun" w:cs="SimSun" w:hint="eastAsia"/>
+          <w:lang w:val="en-US"/>
+        </w:rPr>
+        <w:t>、</w:t>
+      </w:r>
+      <w:proofErr w:type="spellStart"/>
+      <w:r>
+        <w:rPr>
+          <w:lang w:val="en-US"/>
+        </w:rPr>
+        <w:t>TopP</w:t>
+      </w:r>
+      <w:proofErr w:type="spellEnd"/>
+      <w:r>
+        <w:rPr>
+          <w:lang w:val="en-US"/>
+        </w:rPr>
+        <w:t>=0.8</w:t>
+      </w:r>
+      <w:r>
+        <w:rPr>
+          <w:rFonts w:ascii="SimSun" w:eastAsia="SimSun" w:hAnsi="SimSun" w:cs="SimSun" w:hint="eastAsia"/>
+          <w:lang w:val="en-US"/>
+        </w:rPr>
+        <w:t>，采样更</w:t>
+      </w:r>
+      <w:r>
+        <w:rPr>
+          <w:lang w:val="en-US"/>
+        </w:rPr>
+        <w:t xml:space="preserve"> “</w:t>
+      </w:r>
+      <w:r>
+        <w:rPr>
+          <w:rFonts w:ascii="SimSun" w:eastAsia="SimSun" w:hAnsi="SimSun" w:cs="SimSun" w:hint="eastAsia"/>
+          <w:lang w:val="en-US"/>
+        </w:rPr>
+        <w:t>开放</w:t>
+      </w:r>
+      <w:r>
+        <w:rPr>
+          <w:rFonts w:hint="eastAsia"/>
+          <w:lang w:val="en-US"/>
+        </w:rPr>
+        <w:t>”</w:t>
+      </w:r>
+      <w:r>
+        <w:rPr>
+          <w:rFonts w:ascii="SimSun" w:eastAsia="SimSun" w:hAnsi="SimSun" w:cs="SimSun" w:hint="eastAsia"/>
+          <w:lang w:val="en-US"/>
+        </w:rPr>
+        <w:t>，温度一改，回答风格</w:t>
+      </w:r>
+      <w:r>
+        <w:rPr>
+          <w:lang w:val="en-US"/>
+        </w:rPr>
+        <w:t xml:space="preserve"> / </w:t>
+      </w:r>
+      <w:r>
+        <w:rPr>
+          <w:rFonts w:ascii="SimSun" w:eastAsia="SimSun" w:hAnsi="SimSun" w:cs="SimSun" w:hint="eastAsia"/>
+          <w:lang w:val="en-US"/>
+        </w:rPr>
+        <w:t>内容变化很明显。</w:t>
+      </w:r>
+    </w:p>
+    <w:p>
+      <w:pPr>
+        <w:rPr>
+          <w:lang w:val="en-US"/>
+        </w:rPr>
+      </w:pPr>
+      <w:r>
+        <w:rPr>
+          <w:lang w:val="en-US"/>
+        </w:rPr>
+        <w:t>think</w:t>
+      </w:r>
+      <w:r>
+        <w:rPr>
+          <w:rFonts w:ascii="SimSun" w:eastAsia="SimSun" w:hAnsi="SimSun" w:cs="SimSun" w:hint="eastAsia"/>
+          <w:lang w:val="en-US"/>
+        </w:rPr>
+        <w:t>：默认</w:t>
+      </w:r>
+      <w:r>
+        <w:rPr>
+          <w:lang w:val="en-US"/>
+        </w:rPr>
+        <w:t xml:space="preserve"> T=0.6</w:t>
+      </w:r>
+      <w:r>
+        <w:rPr>
+          <w:rFonts w:ascii="SimSun" w:eastAsia="SimSun" w:hAnsi="SimSun" w:cs="SimSun" w:hint="eastAsia"/>
+          <w:lang w:val="en-US"/>
+        </w:rPr>
+        <w:t>、</w:t>
+      </w:r>
+      <w:proofErr w:type="spellStart"/>
+      <w:r>
+        <w:rPr>
+          <w:lang w:val="en-US"/>
+        </w:rPr>
+        <w:t>TopP</w:t>
+      </w:r>
+      <w:proofErr w:type="spellEnd"/>
+      <w:r>
+        <w:rPr>
+          <w:lang w:val="en-US"/>
+        </w:rPr>
+        <w:t>=0.95</w:t>
+      </w:r>
+      <w:r>
+        <w:rPr>
+          <w:rFonts w:ascii="SimSun" w:eastAsia="SimSun" w:hAnsi="SimSun" w:cs="SimSun" w:hint="eastAsia"/>
+          <w:lang w:val="en-US"/>
+        </w:rPr>
+        <w:t>，采样更</w:t>
+      </w:r>
+      <w:r>
+        <w:rPr>
+          <w:lang w:val="en-US"/>
+        </w:rPr>
+        <w:t xml:space="preserve"> “</w:t>
+      </w:r>
+      <w:r>
+        <w:rPr>
+          <w:rFonts w:ascii="SimSun" w:eastAsia="SimSun" w:hAnsi="SimSun" w:cs="SimSun" w:hint="eastAsia"/>
+          <w:lang w:val="en-US"/>
+        </w:rPr>
+        <w:t>集中</w:t>
+      </w:r>
+      <w:r>
+        <w:rPr>
+          <w:rFonts w:hint="eastAsia"/>
+          <w:lang w:val="en-US"/>
+        </w:rPr>
+        <w:t>”</w:t>
+      </w:r>
+      <w:r>
+        <w:rPr>
+          <w:rFonts w:ascii="SimSun" w:eastAsia="SimSun" w:hAnsi="SimSun" w:cs="SimSun" w:hint="eastAsia"/>
+          <w:lang w:val="en-US"/>
+        </w:rPr>
+        <w:t>，温度在</w:t>
+      </w:r>
+      <w:r>
+        <w:rPr>
+          <w:lang w:val="en-US"/>
+        </w:rPr>
+        <w:t xml:space="preserve"> 0.4–0.8 </w:t>
+      </w:r>
+      <w:r>
+        <w:rPr>
+          <w:rFonts w:ascii="SimSun" w:eastAsia="SimSun" w:hAnsi="SimSun" w:cs="SimSun" w:hint="eastAsia"/>
+          <w:lang w:val="en-US"/>
+        </w:rPr>
+        <w:t>之间微调时，推理逻辑基本稳定，变化主要在措辞，不会跑偏。</w:t>
+      </w:r>
+    </w:p>
+    <w:p>
+      <w:pPr>
+        <w:rPr>
+          <w:lang w:val="en-US"/>
+        </w:rPr>
+      </w:pPr>
+      <w:r>
+        <w:rPr>
+          <w:lang w:val="en-US"/>
+        </w:rPr>
+        <w:t xml:space="preserve">3. </w:t>
+      </w:r>
+      <w:r>
+        <w:rPr>
+          <w:rFonts w:ascii="SimSun" w:eastAsia="SimSun" w:hAnsi="SimSun" w:cs="SimSun" w:hint="eastAsia"/>
+          <w:lang w:val="en-US"/>
+        </w:rPr>
+        <w:t>对</w:t>
+      </w:r>
+      <w:r>
+        <w:rPr>
+          <w:lang w:val="en-US"/>
+        </w:rPr>
+        <w:t xml:space="preserve"> “</w:t>
+      </w:r>
+      <w:r>
+        <w:rPr>
+          <w:rFonts w:ascii="SimSun" w:eastAsia="SimSun" w:hAnsi="SimSun" w:cs="SimSun" w:hint="eastAsia"/>
+          <w:lang w:val="en-US"/>
+        </w:rPr>
+        <w:t>冒险</w:t>
+      </w:r>
+      <w:r>
+        <w:rPr>
+          <w:rFonts w:hint="eastAsia"/>
+          <w:lang w:val="en-US"/>
+        </w:rPr>
+        <w:t>”</w:t>
+      </w:r>
+      <w:r>
+        <w:rPr>
+          <w:lang w:val="en-US"/>
+        </w:rPr>
+        <w:t xml:space="preserve"> </w:t>
+      </w:r>
+      <w:r>
+        <w:rPr>
+          <w:rFonts w:ascii="SimSun" w:eastAsia="SimSun" w:hAnsi="SimSun" w:cs="SimSun" w:hint="eastAsia"/>
+          <w:lang w:val="en-US"/>
+        </w:rPr>
+        <w:t>的容忍度</w:t>
+      </w:r>
+    </w:p>
+    <w:p>
+      <w:pPr>
+        <w:rPr>
+          <w:lang w:val="en-US"/>
+        </w:rPr>
+      </w:pPr>
+      <w:proofErr w:type="spellStart"/>
+      <w:r>
+        <w:rPr>
+          <w:lang w:val="en-US"/>
+        </w:rPr>
+        <w:t>no_think</w:t>
+      </w:r>
+      <w:proofErr w:type="spellEnd"/>
+      <w:r>
+        <w:rPr>
+          <w:rFonts w:ascii="SimSun" w:eastAsia="SimSun" w:hAnsi="SimSun" w:cs="SimSun" w:hint="eastAsia"/>
+          <w:lang w:val="en-US"/>
+        </w:rPr>
+        <w:t>：没有中间思考做</w:t>
+      </w:r>
+      <w:r>
+        <w:rPr>
+          <w:lang w:val="en-US"/>
+        </w:rPr>
+        <w:t xml:space="preserve"> “</w:t>
+      </w:r>
+      <w:r>
+        <w:rPr>
+          <w:rFonts w:ascii="SimSun" w:eastAsia="SimSun" w:hAnsi="SimSun" w:cs="SimSun" w:hint="eastAsia"/>
+          <w:lang w:val="en-US"/>
+        </w:rPr>
+        <w:t>缓冲</w:t>
+      </w:r>
+      <w:r>
+        <w:rPr>
+          <w:rFonts w:hint="eastAsia"/>
+          <w:lang w:val="en-US"/>
+        </w:rPr>
+        <w:t>”</w:t>
+      </w:r>
+      <w:r>
+        <w:rPr>
+          <w:rFonts w:ascii="SimSun" w:eastAsia="SimSun" w:hAnsi="SimSun" w:cs="SimSun" w:hint="eastAsia"/>
+          <w:lang w:val="en-US"/>
+        </w:rPr>
+        <w:t>，温度</w:t>
+      </w:r>
+      <w:r>
+        <w:rPr>
+          <w:lang w:val="en-US"/>
+        </w:rPr>
+        <w:t xml:space="preserve">↑ → </w:t>
+      </w:r>
+      <w:r>
+        <w:rPr>
+          <w:rFonts w:ascii="SimSun" w:eastAsia="SimSun" w:hAnsi="SimSun" w:cs="SimSun" w:hint="eastAsia"/>
+          <w:lang w:val="en-US"/>
+        </w:rPr>
+        <w:t>直接更随机、易跑题；温度</w:t>
+      </w:r>
+      <w:r>
+        <w:rPr>
+          <w:lang w:val="en-US"/>
+        </w:rPr>
+        <w:t xml:space="preserve">↓ → </w:t>
+      </w:r>
+      <w:r>
+        <w:rPr>
+          <w:rFonts w:ascii="SimSun" w:eastAsia="SimSun" w:hAnsi="SimSun" w:cs="SimSun" w:hint="eastAsia"/>
+          <w:lang w:val="en-US"/>
+        </w:rPr>
+        <w:t>直接更死板、模板化。</w:t>
+      </w:r>
+    </w:p>
+    <w:p>
+      <w:pPr>
+        <w:rPr>
+          <w:lang w:val="en-US"/>
+        </w:rPr>
+      </w:pPr>
+      <w:r>
+        <w:rPr>
+          <w:lang w:val="en-US"/>
+        </w:rPr>
+        <w:t>think</w:t>
+      </w:r>
+      <w:r>
+        <w:rPr>
+          <w:rFonts w:ascii="SimSun" w:eastAsia="SimSun" w:hAnsi="SimSun" w:cs="SimSun" w:hint="eastAsia"/>
+          <w:lang w:val="en-US"/>
+        </w:rPr>
+        <w:t>：思考链会自我修正，温度</w:t>
+      </w:r>
+      <w:r>
+        <w:rPr>
+          <w:lang w:val="en-US"/>
+        </w:rPr>
+        <w:t xml:space="preserve">↑ </w:t>
+      </w:r>
+      <w:r>
+        <w:rPr>
+          <w:rFonts w:ascii="SimSun" w:eastAsia="SimSun" w:hAnsi="SimSun" w:cs="SimSun" w:hint="eastAsia"/>
+          <w:lang w:val="en-US"/>
+        </w:rPr>
+        <w:t>顶多推理跳跃、啰嗦；温度</w:t>
+      </w:r>
+      <w:r>
+        <w:rPr>
+          <w:lang w:val="en-US"/>
+        </w:rPr>
+        <w:t xml:space="preserve">↓ </w:t>
+      </w:r>
+      <w:r>
+        <w:rPr>
+          <w:rFonts w:ascii="SimSun" w:eastAsia="SimSun" w:hAnsi="SimSun" w:cs="SimSun" w:hint="eastAsia"/>
+          <w:lang w:val="en-US"/>
+        </w:rPr>
+        <w:t>顶多思考保守、步骤少，但答案逻辑不易崩。</w:t>
+      </w:r>
+    </w:p>
+    <w:p>
+      <w:pPr>
+        <w:rPr>
+          <w:lang w:val="en-US"/>
+        </w:rPr>
+      </w:pPr>
+      <w:r>
+        <w:rPr>
+          <w:rFonts w:ascii="SimSun" w:eastAsia="SimSun" w:hAnsi="SimSun" w:cs="SimSun" w:hint="eastAsia"/>
+          <w:lang w:val="en-US"/>
+        </w:rPr>
+        <w:lastRenderedPageBreak/>
+        <w:t>二、两种模式下</w:t>
+      </w:r>
+      <w:r>
+        <w:rPr>
+          <w:lang w:val="en-US"/>
+        </w:rPr>
+        <w:t xml:space="preserve"> temperature </w:t>
+      </w:r>
+      <w:r>
+        <w:rPr>
+          <w:rFonts w:ascii="SimSun" w:eastAsia="SimSun" w:hAnsi="SimSun" w:cs="SimSun" w:hint="eastAsia"/>
+          <w:lang w:val="en-US"/>
+        </w:rPr>
+        <w:t>变化的实际表现</w:t>
+      </w:r>
+    </w:p>
+    <w:p>
+      <w:pPr>
+        <w:rPr>
+          <w:lang w:val="en-US"/>
+        </w:rPr>
+      </w:pPr>
+      <w:r>
+        <w:rPr>
+          <w:rFonts w:ascii="SimSun" w:eastAsia="SimSun" w:hAnsi="SimSun" w:cs="SimSun" w:hint="eastAsia"/>
+          <w:lang w:val="en-US"/>
+        </w:rPr>
+        <w:t>非思考模式（影响大）</w:t>
+      </w:r>
+    </w:p>
+    <w:p>
+      <w:pPr>
+        <w:rPr>
+          <w:lang w:val="en-US"/>
+        </w:rPr>
+      </w:pPr>
+      <w:r>
+        <w:rPr>
+          <w:lang w:val="en-US"/>
+        </w:rPr>
+        <w:t>T=0.1–0.3</w:t>
+      </w:r>
+      <w:r>
+        <w:rPr>
+          <w:rFonts w:ascii="SimSun" w:eastAsia="SimSun" w:hAnsi="SimSun" w:cs="SimSun" w:hint="eastAsia"/>
+          <w:lang w:val="en-US"/>
+        </w:rPr>
+        <w:t>：非常固定，几乎每次回答一样，像模板，适合翻译、代码、标准答案。</w:t>
+      </w:r>
+    </w:p>
+    <w:p>
+      <w:pPr>
+        <w:rPr>
+          <w:lang w:val="en-US"/>
+        </w:rPr>
+      </w:pPr>
+      <w:r>
+        <w:rPr>
+          <w:lang w:val="en-US"/>
+        </w:rPr>
+        <w:t>T=0.7</w:t>
+      </w:r>
+      <w:r>
+        <w:rPr>
+          <w:rFonts w:ascii="SimSun" w:eastAsia="SimSun" w:hAnsi="SimSun" w:cs="SimSun" w:hint="eastAsia"/>
+          <w:lang w:val="en-US"/>
+        </w:rPr>
+        <w:t>：自然但易飘，换个问题或重发，回答差异明显，适合日常聊天、文案。</w:t>
+      </w:r>
+    </w:p>
+    <w:p>
+      <w:pPr>
+        <w:rPr>
+          <w:lang w:val="en-US"/>
+        </w:rPr>
+      </w:pPr>
+      <w:r>
+        <w:rPr>
+          <w:lang w:val="en-US"/>
+        </w:rPr>
+        <w:t>T=1.0+</w:t>
+      </w:r>
+      <w:r>
+        <w:rPr>
+          <w:rFonts w:ascii="SimSun" w:eastAsia="SimSun" w:hAnsi="SimSun" w:cs="SimSun" w:hint="eastAsia"/>
+          <w:lang w:val="en-US"/>
+        </w:rPr>
+        <w:t>：随机、易胡说，经常跑题、前后矛盾。</w:t>
+      </w:r>
+    </w:p>
+    <w:p>
+      <w:pPr>
+        <w:rPr>
+          <w:lang w:val="en-US"/>
+        </w:rPr>
+      </w:pPr>
+      <w:r>
+        <w:rPr>
+          <w:rFonts w:ascii="SimSun" w:eastAsia="SimSun" w:hAnsi="SimSun" w:cs="SimSun" w:hint="eastAsia"/>
+          <w:lang w:val="en-US"/>
+        </w:rPr>
+        <w:t>思考模式（影响小）</w:t>
+      </w:r>
+    </w:p>
+    <w:p>
+      <w:pPr>
+        <w:rPr>
+          <w:lang w:val="en-US"/>
+        </w:rPr>
+      </w:pPr>
+      <w:r>
+        <w:rPr>
+          <w:lang w:val="en-US"/>
+        </w:rPr>
+        <w:t>T=0.3–0.5</w:t>
+      </w:r>
+      <w:r>
+        <w:rPr>
+          <w:rFonts w:ascii="SimSun" w:eastAsia="SimSun" w:hAnsi="SimSun" w:cs="SimSun" w:hint="eastAsia"/>
+          <w:lang w:val="en-US"/>
+        </w:rPr>
+        <w:t>：严谨、步骤清晰，推理稳、答案准，适合数学、逻辑、工具调用。</w:t>
+      </w:r>
+    </w:p>
+    <w:p>
+      <w:pPr>
+        <w:rPr>
+          <w:lang w:val="en-US"/>
+        </w:rPr>
+      </w:pPr>
+      <w:r>
+        <w:rPr>
+          <w:lang w:val="en-US"/>
+        </w:rPr>
+        <w:t>T=0.6</w:t>
+      </w:r>
+      <w:r>
+        <w:rPr>
+          <w:rFonts w:ascii="SimSun" w:eastAsia="SimSun" w:hAnsi="SimSun" w:cs="SimSun" w:hint="eastAsia"/>
+          <w:lang w:val="en-US"/>
+        </w:rPr>
+        <w:t>（推荐）：平衡，推理不死板、答案不随机，通用场景最佳。</w:t>
+      </w:r>
+    </w:p>
+    <w:p>
+      <w:pPr>
+        <w:rPr>
+          <w:lang w:val="en-US"/>
+        </w:rPr>
+      </w:pPr>
+      <w:r>
+        <w:rPr>
+          <w:lang w:val="en-US"/>
+        </w:rPr>
+        <w:t>T=0.7–0.8</w:t>
+      </w:r>
+      <w:r>
+        <w:rPr>
+          <w:rFonts w:ascii="SimSun" w:eastAsia="SimSun" w:hAnsi="SimSun" w:cs="SimSun" w:hint="eastAsia"/>
+          <w:lang w:val="en-US"/>
+        </w:rPr>
+        <w:t>：推理更发散、答案措辞更多样，但逻辑依然连贯，适合需要多角度分析。</w:t>
+      </w:r>
+    </w:p>
+    <w:p>
+      <w:pPr>
+        <w:rPr>
+          <w:lang w:val="en-US"/>
+        </w:rPr>
+      </w:pPr>
+      <w:r>
+        <w:rPr>
+          <w:rFonts w:ascii="SimSun" w:eastAsia="SimSun" w:hAnsi="SimSun" w:cs="SimSun" w:hint="eastAsia"/>
+          <w:lang w:val="en-US"/>
+        </w:rPr>
+        <w:t>一句话：</w:t>
+      </w:r>
+      <w:proofErr w:type="spellStart"/>
+      <w:r>
+        <w:rPr>
+          <w:lang w:val="en-US"/>
+        </w:rPr>
+        <w:t>no_think</w:t>
+      </w:r>
+      <w:proofErr w:type="spellEnd"/>
+      <w:r>
+        <w:rPr>
+          <w:lang w:val="en-US"/>
+        </w:rPr>
+        <w:t xml:space="preserve"> </w:t>
+      </w:r>
+      <w:r>
+        <w:rPr>
+          <w:rFonts w:ascii="SimSun" w:eastAsia="SimSun" w:hAnsi="SimSun" w:cs="SimSun" w:hint="eastAsia"/>
+          <w:lang w:val="en-US"/>
+        </w:rPr>
+        <w:t>是</w:t>
+      </w:r>
+      <w:r>
+        <w:rPr>
+          <w:lang w:val="en-US"/>
+        </w:rPr>
+        <w:t xml:space="preserve"> “</w:t>
+      </w:r>
+      <w:r>
+        <w:rPr>
+          <w:rFonts w:ascii="SimSun" w:eastAsia="SimSun" w:hAnsi="SimSun" w:cs="SimSun" w:hint="eastAsia"/>
+          <w:lang w:val="en-US"/>
+        </w:rPr>
+        <w:t>陡变</w:t>
+      </w:r>
+      <w:r>
+        <w:rPr>
+          <w:rFonts w:hint="eastAsia"/>
+          <w:lang w:val="en-US"/>
+        </w:rPr>
+        <w:t>”</w:t>
+      </w:r>
+      <w:r>
+        <w:rPr>
+          <w:rFonts w:ascii="SimSun" w:eastAsia="SimSun" w:hAnsi="SimSun" w:cs="SimSun" w:hint="eastAsia"/>
+          <w:lang w:val="en-US"/>
+        </w:rPr>
+        <w:t>，</w:t>
+      </w:r>
+      <w:r>
+        <w:rPr>
+          <w:lang w:val="en-US"/>
+        </w:rPr>
+        <w:t xml:space="preserve">think </w:t>
+      </w:r>
+      <w:r>
+        <w:rPr>
+          <w:rFonts w:ascii="SimSun" w:eastAsia="SimSun" w:hAnsi="SimSun" w:cs="SimSun" w:hint="eastAsia"/>
+          <w:lang w:val="en-US"/>
+        </w:rPr>
+        <w:t>是</w:t>
+      </w:r>
+      <w:r>
+        <w:rPr>
+          <w:lang w:val="en-US"/>
+        </w:rPr>
+        <w:t xml:space="preserve"> “</w:t>
+      </w:r>
+      <w:r>
+        <w:rPr>
+          <w:rFonts w:ascii="SimSun" w:eastAsia="SimSun" w:hAnsi="SimSun" w:cs="SimSun" w:hint="eastAsia"/>
+          <w:lang w:val="en-US"/>
+        </w:rPr>
+        <w:t>缓变</w:t>
+      </w:r>
+      <w:r>
+        <w:rPr>
+          <w:rFonts w:hint="eastAsia"/>
+          <w:lang w:val="en-US"/>
+        </w:rPr>
+        <w:t>”</w:t>
+      </w:r>
+      <w:r>
+        <w:rPr>
+          <w:rFonts w:ascii="SimSun" w:eastAsia="SimSun" w:hAnsi="SimSun" w:cs="SimSun" w:hint="eastAsia"/>
+          <w:lang w:val="en-US"/>
+        </w:rPr>
+        <w:t>。</w:t>
+      </w:r>
+    </w:p>
+    <w:p>
+      <w:pPr>
+        <w:rPr>
+          <w:lang w:val="en-US"/>
+        </w:rPr>
+      </w:pPr>
+      <w:r>
+        <w:rPr>
+          <w:rFonts w:ascii="SimSun" w:eastAsia="SimSun" w:hAnsi="SimSun" w:cs="SimSun" w:hint="eastAsia"/>
+          <w:lang w:val="en-US"/>
+        </w:rPr>
+        <w:t>三、测试</w:t>
+      </w:r>
+      <w:r>
+        <w:rPr>
+          <w:lang w:val="en-US"/>
+        </w:rPr>
+        <w:t xml:space="preserve"> temperature </w:t>
+      </w:r>
+      <w:r>
+        <w:rPr>
+          <w:rFonts w:ascii="SimSun" w:eastAsia="SimSun" w:hAnsi="SimSun" w:cs="SimSun" w:hint="eastAsia"/>
+          <w:lang w:val="en-US"/>
+        </w:rPr>
+        <w:t>该用哪种模式？</w:t>
+      </w:r>
+    </w:p>
+    <w:p>
+      <w:pPr>
+        <w:rPr>
+          <w:lang w:val="en-US"/>
+        </w:rPr>
+      </w:pPr>
+      <w:r>
+        <w:rPr>
+          <w:rFonts w:ascii="SimSun" w:eastAsia="SimSun" w:hAnsi="SimSun" w:cs="SimSun" w:hint="eastAsia"/>
+          <w:lang w:val="en-US"/>
+        </w:rPr>
+        <w:t>想快速看出温度差异</w:t>
+      </w:r>
+      <w:r>
+        <w:rPr>
+          <w:lang w:val="en-US"/>
+        </w:rPr>
+        <w:t xml:space="preserve"> → </w:t>
+      </w:r>
+      <w:r>
+        <w:rPr>
+          <w:rFonts w:ascii="SimSun" w:eastAsia="SimSun" w:hAnsi="SimSun" w:cs="SimSun" w:hint="eastAsia"/>
+          <w:lang w:val="en-US"/>
+        </w:rPr>
+        <w:t>用非思考模式：同样问题，</w:t>
+      </w:r>
+      <w:r>
+        <w:rPr>
+          <w:lang w:val="en-US"/>
+        </w:rPr>
+        <w:t>T=0.3 vs T=0.9</w:t>
+      </w:r>
+      <w:r>
+        <w:rPr>
+          <w:rFonts w:ascii="SimSun" w:eastAsia="SimSun" w:hAnsi="SimSun" w:cs="SimSun" w:hint="eastAsia"/>
+          <w:lang w:val="en-US"/>
+        </w:rPr>
+        <w:t>，回答风格</w:t>
+      </w:r>
+      <w:r>
+        <w:rPr>
+          <w:lang w:val="en-US"/>
+        </w:rPr>
+        <w:t xml:space="preserve"> / </w:t>
+      </w:r>
+      <w:r>
+        <w:rPr>
+          <w:rFonts w:ascii="SimSun" w:eastAsia="SimSun" w:hAnsi="SimSun" w:cs="SimSun" w:hint="eastAsia"/>
+          <w:lang w:val="en-US"/>
+        </w:rPr>
+        <w:t>内容差异一眼可见。</w:t>
+      </w:r>
+    </w:p>
+    <w:p>
+      <w:pPr>
+        <w:rPr>
+          <w:lang w:val="en-US"/>
+        </w:rPr>
+      </w:pPr>
+      <w:r>
+        <w:rPr>
+          <w:rFonts w:ascii="SimSun" w:eastAsia="SimSun" w:hAnsi="SimSun" w:cs="SimSun" w:hint="eastAsia"/>
+          <w:lang w:val="en-US"/>
+        </w:rPr>
+        <w:t>想测</w:t>
+      </w:r>
+      <w:r>
+        <w:rPr>
+          <w:lang w:val="en-US"/>
+        </w:rPr>
+        <w:t xml:space="preserve"> “</w:t>
+      </w:r>
+      <w:r>
+        <w:rPr>
+          <w:rFonts w:ascii="SimSun" w:eastAsia="SimSun" w:hAnsi="SimSun" w:cs="SimSun" w:hint="eastAsia"/>
+          <w:lang w:val="en-US"/>
+        </w:rPr>
+        <w:t>推理稳定性</w:t>
+      </w:r>
+      <w:r>
+        <w:rPr>
+          <w:rFonts w:hint="eastAsia"/>
+          <w:lang w:val="en-US"/>
+        </w:rPr>
+        <w:t>”</w:t>
+      </w:r>
+      <w:r>
+        <w:rPr>
+          <w:lang w:val="en-US"/>
+        </w:rPr>
+        <w:t xml:space="preserve"> → </w:t>
+      </w:r>
+      <w:r>
+        <w:rPr>
+          <w:rFonts w:ascii="SimSun" w:eastAsia="SimSun" w:hAnsi="SimSun" w:cs="SimSun" w:hint="eastAsia"/>
+          <w:lang w:val="en-US"/>
+        </w:rPr>
+        <w:t>用思考模式：看温度变化是否影响逻辑链、步骤完整性、答案正确性。</w:t>
+      </w:r>
+    </w:p>
+    <w:bookmarkEnd w:id="6"/>
+    <w:p>
+      <w:pPr>
+        <w:rPr>
+          <w:rFonts w:eastAsia="SimSun"/>
+          <w:lang w:val="en-US"/>
+        </w:rPr>
+      </w:pPr>
+    </w:p>
+    <w:p>
+      <w:pPr>
+        <w:rPr>
+          <w:rFonts w:eastAsia="SimSun"/>
+          <w:lang w:val="en-US"/>
+        </w:rPr>
+      </w:pPr>
+    </w:p>
+    <w:p>
+      <w:pPr>
+        <w:rPr>
+          <w:rFonts w:eastAsia="SimSun"/>
+          <w:lang w:val="en-US"/>
+        </w:rPr>
+      </w:pPr>
+      <w:r>
+        <w:rPr>
+          <w:rFonts w:eastAsia="SimSun" w:hint="eastAsia"/>
+          <w:lang w:val="en-US"/>
+        </w:rPr>
+        <w:t>[</w:t>
+      </w:r>
+      <w:r>
+        <w:rPr>
+          <w:rFonts w:eastAsia="SimSun" w:hint="eastAsia"/>
+          <w:lang w:val="en-US"/>
+        </w:rPr>
+        <w:t>问题</w:t>
+      </w:r>
+      <w:r>
+        <w:rPr>
+          <w:rFonts w:eastAsia="SimSun" w:hint="eastAsia"/>
+          <w:lang w:val="en-US"/>
+        </w:rPr>
+        <w:t>2]:</w:t>
+      </w:r>
+    </w:p>
+    <w:p>
+      <w:pPr>
+        <w:rPr>
+          <w:rFonts w:eastAsia="SimSun"/>
+          <w:lang w:val="en-US"/>
+        </w:rPr>
+      </w:pPr>
+      <w:r>
+        <w:rPr>
+          <w:rFonts w:eastAsia="SimSun" w:hint="eastAsia"/>
+          <w:lang w:val="en-US"/>
+        </w:rPr>
+        <w:t xml:space="preserve">Temperature 0.0 </w:t>
+      </w:r>
+      <w:r>
+        <w:rPr>
+          <w:rFonts w:eastAsia="SimSun" w:hint="eastAsia"/>
+          <w:lang w:val="en-US"/>
+        </w:rPr>
+        <w:t>和</w:t>
+      </w:r>
+      <w:r>
+        <w:rPr>
+          <w:rFonts w:eastAsia="SimSun" w:hint="eastAsia"/>
+          <w:lang w:val="en-US"/>
+        </w:rPr>
+        <w:t xml:space="preserve">Temperature 0.5 1.0 </w:t>
+      </w:r>
+      <w:r>
+        <w:rPr>
+          <w:rFonts w:eastAsia="SimSun" w:hint="eastAsia"/>
+          <w:lang w:val="en-US"/>
+        </w:rPr>
+        <w:t>的发散性差别不大</w:t>
+      </w:r>
+      <w:r>
+        <w:rPr>
+          <w:rFonts w:eastAsia="SimSun" w:hint="eastAsia"/>
+          <w:lang w:val="en-US"/>
+        </w:rPr>
+        <w:t xml:space="preserve"> </w:t>
+      </w:r>
+      <w:r>
+        <w:rPr>
+          <w:rFonts w:eastAsia="SimSun" w:hint="eastAsia"/>
+          <w:lang w:val="en-US"/>
+        </w:rPr>
+        <w:t>都不太重复</w:t>
+      </w:r>
+    </w:p>
+    <w:p>
+      <w:pPr>
+        <w:rPr>
+          <w:rFonts w:eastAsia="SimSun"/>
+          <w:lang w:val="en-US"/>
+        </w:rPr>
+      </w:pPr>
+      <w:r>
+        <w:rPr>
+          <w:rFonts w:eastAsia="SimSun" w:hint="eastAsia"/>
+          <w:lang w:val="en-US"/>
+        </w:rPr>
+        <w:t>Potential Cause:</w:t>
+      </w:r>
+    </w:p>
+    <w:p>
+      <w:pPr>
+        <w:rPr>
+          <w:rFonts w:eastAsia="SimSun"/>
+          <w:lang w:val="en-US"/>
+        </w:rPr>
+      </w:pPr>
+      <w:r>
+        <w:rPr>
+          <w:rFonts w:eastAsia="SimSun" w:hint="eastAsia"/>
+          <w:lang w:val="en-US"/>
+        </w:rPr>
+        <w:t xml:space="preserve">1. </w:t>
+      </w:r>
+      <w:proofErr w:type="spellStart"/>
+      <w:r>
+        <w:rPr>
+          <w:rFonts w:eastAsia="SimSun" w:hint="eastAsia"/>
+          <w:lang w:val="en-US"/>
+        </w:rPr>
+        <w:t>qwen</w:t>
+      </w:r>
+      <w:proofErr w:type="spellEnd"/>
+      <w:r>
+        <w:rPr>
+          <w:rFonts w:eastAsia="SimSun" w:hint="eastAsia"/>
+          <w:lang w:val="en-US"/>
+        </w:rPr>
+        <w:t>-plus</w:t>
+      </w:r>
+      <w:r>
+        <w:rPr>
+          <w:rFonts w:eastAsia="SimSun" w:hint="eastAsia"/>
+          <w:lang w:val="en-US"/>
+        </w:rPr>
+        <w:t>对</w:t>
+      </w:r>
+      <w:r>
+        <w:rPr>
+          <w:rFonts w:eastAsia="SimSun" w:hint="eastAsia"/>
+          <w:lang w:val="en-US"/>
+        </w:rPr>
+        <w:t>Temperature</w:t>
+      </w:r>
+      <w:r>
+        <w:rPr>
+          <w:rFonts w:eastAsia="SimSun" w:hint="eastAsia"/>
+          <w:lang w:val="en-US"/>
+        </w:rPr>
+        <w:t>的实现不是很完整</w:t>
+      </w:r>
+    </w:p>
+    <w:p>
+      <w:pPr>
+        <w:rPr>
+          <w:rFonts w:eastAsia="SimSun"/>
+          <w:lang w:val="en-US"/>
+        </w:rPr>
+      </w:pPr>
+      <w:r>
+        <w:rPr>
+          <w:rFonts w:eastAsia="SimSun" w:hint="eastAsia"/>
+          <w:lang w:val="en-US"/>
+        </w:rPr>
+        <w:t xml:space="preserve">2. </w:t>
+      </w:r>
+      <w:r>
+        <w:rPr>
+          <w:rFonts w:eastAsia="SimSun" w:hint="eastAsia"/>
+          <w:lang w:val="en-US"/>
+        </w:rPr>
+        <w:t>问题类型过于复杂</w:t>
+      </w:r>
+      <w:r>
+        <w:rPr>
+          <w:rFonts w:eastAsia="SimSun" w:hint="eastAsia"/>
+          <w:lang w:val="en-US"/>
+        </w:rPr>
+        <w:t xml:space="preserve">, </w:t>
+      </w:r>
+      <w:r>
+        <w:rPr>
+          <w:rFonts w:eastAsia="SimSun" w:hint="eastAsia"/>
+          <w:lang w:val="en-US"/>
+        </w:rPr>
+        <w:t>即使是相同的问题在</w:t>
+      </w:r>
+      <w:r>
+        <w:rPr>
+          <w:rFonts w:eastAsia="SimSun" w:hint="eastAsia"/>
+          <w:lang w:val="en-US"/>
+        </w:rPr>
+        <w:t>temperature 0</w:t>
+      </w:r>
+      <w:r>
+        <w:rPr>
+          <w:rFonts w:eastAsia="SimSun"/>
+          <w:lang w:val="en-US"/>
+        </w:rPr>
+        <w:t xml:space="preserve">.0 </w:t>
+      </w:r>
+      <w:r>
+        <w:rPr>
+          <w:rFonts w:eastAsia="SimSun" w:hint="eastAsia"/>
+          <w:lang w:val="en-US"/>
+        </w:rPr>
+        <w:t>的情况下依然可能</w:t>
+      </w:r>
+      <w:r>
+        <w:rPr>
+          <w:rFonts w:eastAsia="SimSun" w:hint="eastAsia"/>
+          <w:lang w:val="en-US"/>
+        </w:rPr>
+        <w:t>使用不同的推理路径</w:t>
+      </w:r>
+      <w:r>
+        <w:rPr>
+          <w:rFonts w:eastAsia="SimSun" w:hint="eastAsia"/>
+          <w:lang w:val="en-US"/>
+        </w:rPr>
+        <w:t xml:space="preserve">, </w:t>
+      </w:r>
+      <w:r>
+        <w:rPr>
+          <w:rFonts w:eastAsia="SimSun" w:hint="eastAsia"/>
+          <w:lang w:val="en-US"/>
+        </w:rPr>
+        <w:t>生成不同格式的建议</w:t>
+      </w:r>
+      <w:r>
+        <w:rPr>
+          <w:rFonts w:eastAsia="SimSun" w:hint="eastAsia"/>
+          <w:lang w:val="en-US"/>
+        </w:rPr>
+        <w:t xml:space="preserve">, </w:t>
+      </w:r>
+      <w:r>
+        <w:rPr>
+          <w:rFonts w:eastAsia="SimSun" w:hint="eastAsia"/>
+          <w:lang w:val="en-US"/>
+        </w:rPr>
+        <w:t>选择不同的表达方式</w:t>
+      </w:r>
+      <w:r>
+        <w:rPr>
+          <w:rFonts w:eastAsia="SimSun" w:hint="eastAsia"/>
+          <w:lang w:val="en-US"/>
+        </w:rPr>
+        <w:t xml:space="preserve">, </w:t>
+      </w:r>
+      <w:r>
+        <w:rPr>
+          <w:rFonts w:eastAsia="SimSun" w:hint="eastAsia"/>
+          <w:lang w:val="en-US"/>
+        </w:rPr>
+        <w:t>包含不同的例子和说明</w:t>
+      </w:r>
+    </w:p>
+    <w:p>
+      <w:pPr>
+        <w:rPr>
+          <w:rFonts w:eastAsia="SimSun"/>
+          <w:lang w:val="en-US"/>
+        </w:rPr>
+      </w:pPr>
+    </w:p>
+    <w:p>
+      <w:pPr>
+        <w:rPr>
+          <w:rFonts w:eastAsia="SimSun"/>
+          <w:lang w:val="en-US"/>
+        </w:rPr>
+      </w:pPr>
+      <w:r>
+        <w:rPr>
+          <w:rFonts w:eastAsia="SimSun" w:hint="eastAsia"/>
+          <w:lang w:val="en-US"/>
+        </w:rPr>
+        <w:t>修改</w:t>
+      </w:r>
+      <w:r>
+        <w:rPr>
+          <w:rFonts w:eastAsia="SimSun" w:hint="eastAsia"/>
+          <w:lang w:val="en-US"/>
+        </w:rPr>
+        <w:t>:</w:t>
+      </w:r>
+    </w:p>
+    <w:p>
+      <w:pPr>
+        <w:rPr>
+          <w:rFonts w:eastAsia="SimSun"/>
+          <w:lang w:val="en-US"/>
+        </w:rPr>
+      </w:pPr>
+      <w:r>
+        <w:rPr>
+          <w:rFonts w:eastAsia="SimSun" w:hint="eastAsia"/>
+          <w:lang w:val="en-US"/>
+        </w:rPr>
+        <w:t xml:space="preserve">1. </w:t>
+      </w:r>
+      <w:r>
+        <w:rPr>
+          <w:rFonts w:eastAsia="SimSun" w:hint="eastAsia"/>
+          <w:lang w:val="en-US"/>
+        </w:rPr>
+        <w:t>更换模型</w:t>
+      </w:r>
+      <w:proofErr w:type="spellStart"/>
+      <w:r>
+        <w:rPr>
+          <w:rFonts w:eastAsia="SimSun" w:hint="eastAsia"/>
+          <w:lang w:val="en-US"/>
+        </w:rPr>
+        <w:t>qwen</w:t>
+      </w:r>
+      <w:proofErr w:type="spellEnd"/>
+      <w:r>
+        <w:rPr>
+          <w:rFonts w:eastAsia="SimSun"/>
+          <w:lang w:val="en-US"/>
+        </w:rPr>
+        <w:t>-max</w:t>
+      </w:r>
+    </w:p>
+    <w:p>
+      <w:pPr>
+        <w:rPr>
+          <w:rFonts w:eastAsia="SimSun"/>
+          <w:lang w:val="en-US"/>
+        </w:rPr>
+      </w:pPr>
+      <w:r>
+        <w:rPr>
+          <w:rFonts w:eastAsia="SimSun" w:hint="eastAsia"/>
+          <w:lang w:val="en-US"/>
+        </w:rPr>
+        <w:t xml:space="preserve">2. </w:t>
+      </w:r>
+      <w:r>
+        <w:rPr>
+          <w:rFonts w:eastAsia="SimSun" w:hint="eastAsia"/>
+          <w:lang w:val="en-US"/>
+        </w:rPr>
+        <w:t xml:space="preserve"> </w:t>
+      </w:r>
+      <w:r>
+        <w:rPr>
+          <w:rFonts w:eastAsia="SimSun" w:hint="eastAsia"/>
+          <w:lang w:val="en-US"/>
+        </w:rPr>
+        <w:t>修改为更加简单的问题</w:t>
+      </w:r>
+    </w:p>
+    <w:p>
+      <w:pPr>
+        <w:rPr>
+          <w:rFonts w:eastAsia="SimSun"/>
+          <w:lang w:val="en-US"/>
+        </w:rPr>
+      </w:pPr>
+      <w:r>
+        <w:rPr>
+          <w:rFonts w:eastAsia="SimSun" w:hint="eastAsia"/>
+          <w:lang w:val="en-US"/>
+        </w:rPr>
+        <w:t xml:space="preserve">3. </w:t>
+      </w:r>
+      <w:r>
+        <w:rPr>
+          <w:rFonts w:eastAsia="SimSun" w:hint="eastAsia"/>
+          <w:lang w:val="en-US"/>
+        </w:rPr>
+        <w:t>设置</w:t>
+      </w:r>
+      <w:proofErr w:type="spellStart"/>
+      <w:r>
+        <w:rPr>
+          <w:rFonts w:eastAsia="SimSun" w:hint="eastAsia"/>
+          <w:lang w:val="en-US"/>
+        </w:rPr>
+        <w:t>top</w:t>
+      </w:r>
+      <w:r>
+        <w:rPr>
+          <w:rFonts w:eastAsia="SimSun"/>
+          <w:lang w:val="en-US"/>
+        </w:rPr>
+        <w:t>_k</w:t>
+      </w:r>
+      <w:proofErr w:type="spellEnd"/>
+      <w:r>
+        <w:rPr>
+          <w:rFonts w:eastAsia="SimSun"/>
+          <w:lang w:val="en-US"/>
+        </w:rPr>
+        <w:t>=1 (</w:t>
+      </w:r>
+      <w:r>
+        <w:rPr>
+          <w:rFonts w:eastAsia="SimSun" w:hint="eastAsia"/>
+          <w:lang w:val="en-US"/>
+        </w:rPr>
+        <w:t>衍生出</w:t>
+      </w:r>
+      <w:proofErr w:type="spellStart"/>
+      <w:r>
+        <w:rPr>
+          <w:rFonts w:eastAsia="SimSun" w:hint="eastAsia"/>
+          <w:lang w:val="en-US"/>
+        </w:rPr>
+        <w:t>top</w:t>
+      </w:r>
+      <w:r>
+        <w:rPr>
+          <w:rFonts w:eastAsia="SimSun"/>
+          <w:lang w:val="en-US"/>
+        </w:rPr>
+        <w:t>_k</w:t>
+      </w:r>
+      <w:proofErr w:type="spellEnd"/>
+      <w:r>
+        <w:rPr>
+          <w:rFonts w:eastAsia="SimSun"/>
+          <w:lang w:val="en-US"/>
+        </w:rPr>
+        <w:t>=1</w:t>
+      </w:r>
+      <w:r>
+        <w:rPr>
+          <w:rFonts w:eastAsia="SimSun" w:hint="eastAsia"/>
+          <w:lang w:val="en-US"/>
+        </w:rPr>
+        <w:t>的学习</w:t>
+      </w:r>
+      <w:r>
+        <w:rPr>
+          <w:rFonts w:eastAsia="SimSun" w:hint="eastAsia"/>
+          <w:lang w:val="en-US"/>
+        </w:rPr>
+        <w:t>)</w:t>
+      </w:r>
+    </w:p>
+    <w:p>
+      <w:pPr>
+        <w:rPr>
+          <w:rFonts w:eastAsia="SimSun"/>
+          <w:lang w:val="en-US"/>
+        </w:rPr>
+      </w:pPr>
+    </w:p>
+    <w:p>
+      <w:pPr>
+        <w:rPr>
+          <w:rFonts w:eastAsia="SimSun"/>
+          <w:lang w:val="en-US"/>
+        </w:rPr>
+      </w:pPr>
+      <w:r>
+        <w:rPr>
+          <w:rFonts w:eastAsia="SimSun" w:hint="eastAsia"/>
+          <w:lang w:val="en-US"/>
+        </w:rPr>
+        <w:t>6.10</w:t>
+      </w:r>
+    </w:p>
+    <w:p>
+      <w:pPr>
+        <w:rPr>
+          <w:rFonts w:eastAsia="SimSun"/>
+          <w:lang w:val="en-US"/>
+        </w:rPr>
+      </w:pPr>
+    </w:p>
+    <w:p>
+      <w:pPr>
+        <w:rPr>
+          <w:rFonts w:eastAsia="SimSun"/>
+          <w:lang w:val="en-US"/>
+        </w:rPr>
+      </w:pPr>
+      <w:r>
+        <w:rPr>
+          <w:rFonts w:eastAsia="SimSun" w:hint="eastAsia"/>
+          <w:lang w:val="en-US"/>
+        </w:rPr>
+        <w:t>[</w:t>
+      </w:r>
+      <w:r>
+        <w:rPr>
+          <w:rFonts w:eastAsia="SimSun" w:hint="eastAsia"/>
+          <w:lang w:val="en-US"/>
+        </w:rPr>
+        <w:t>问题</w:t>
+      </w:r>
+      <w:r>
+        <w:rPr>
+          <w:rFonts w:eastAsia="SimSun" w:hint="eastAsia"/>
+          <w:lang w:val="en-US"/>
+        </w:rPr>
+        <w:t xml:space="preserve"> 3]:</w:t>
+      </w:r>
+    </w:p>
+    <w:p>
+      <w:pPr>
+        <w:rPr>
+          <w:rFonts w:eastAsia="SimSun"/>
+          <w:lang w:val="en-US"/>
+        </w:rPr>
+      </w:pPr>
+      <w:r>
+        <w:rPr>
+          <w:rFonts w:eastAsia="SimSun" w:hint="eastAsia"/>
+          <w:lang w:val="en-US"/>
+        </w:rPr>
+        <w:t>经过上述修改之后出现了矫枉过正的问题</w:t>
+      </w:r>
+      <w:r>
+        <w:rPr>
+          <w:rFonts w:eastAsia="SimSun" w:hint="eastAsia"/>
+          <w:lang w:val="en-US"/>
+        </w:rPr>
+        <w:t>:</w:t>
+      </w:r>
+    </w:p>
+    <w:p>
+      <w:pPr>
+        <w:rPr>
+          <w:rFonts w:ascii="SimSun" w:eastAsia="SimSun" w:hAnsi="SimSun" w:cs="SimSun"/>
+          <w:lang w:val="en-US"/>
+        </w:rPr>
+      </w:pPr>
+      <w:r>
+        <w:rPr>
+          <w:rFonts w:eastAsia="SimSun" w:hint="eastAsia"/>
+          <w:lang w:val="en-US"/>
+        </w:rPr>
+        <w:t>所有</w:t>
+      </w:r>
+      <w:r>
+        <w:rPr>
+          <w:lang w:val="en-US"/>
+        </w:rPr>
+        <w:t>temperature</w:t>
+      </w:r>
+      <w:r>
+        <w:rPr>
+          <w:rFonts w:ascii="SimSun" w:eastAsia="SimSun" w:hAnsi="SimSun" w:cs="SimSun" w:hint="eastAsia"/>
+          <w:lang w:val="en-US"/>
+        </w:rPr>
+        <w:t>的输出都几乎如出一辙(值得注意的是 只有**湿度**这一个字段有数值上的差异</w:t>
+      </w:r>
+      <w:r>
+        <w:rPr>
+          <w:rFonts w:ascii="SimSun" w:eastAsia="SimSun" w:hAnsi="SimSun" w:cs="SimSun"/>
+          <w:lang w:val="en-US"/>
+        </w:rPr>
+        <w:t xml:space="preserve"> </w:t>
+      </w:r>
+      <w:r>
+        <w:rPr>
+          <w:rFonts w:ascii="SimSun" w:eastAsia="SimSun" w:hAnsi="SimSun" w:cs="SimSun" w:hint="eastAsia"/>
+          <w:lang w:val="en-US"/>
+        </w:rPr>
+        <w:t>详情见</w:t>
+      </w:r>
+      <w:r>
+        <w:rPr>
+          <w:rFonts w:ascii="SimSun" w:eastAsia="SimSun" w:hAnsi="SimSun" w:cs="SimSun" w:hint="eastAsia"/>
+          <w:i/>
+          <w:iCs/>
+          <w:lang w:val="en-US"/>
+        </w:rPr>
+        <w:t>humidity</w:t>
+      </w:r>
+      <w:r>
+        <w:rPr>
+          <w:rFonts w:ascii="SimSun" w:eastAsia="SimSun" w:hAnsi="SimSun" w:cs="SimSun"/>
+          <w:i/>
+          <w:iCs/>
+          <w:lang w:val="en-US"/>
+        </w:rPr>
+        <w:t>_problem.log</w:t>
+      </w:r>
+      <w:r>
+        <w:rPr>
+          <w:rFonts w:ascii="SimSun" w:eastAsia="SimSun" w:hAnsi="SimSun" w:cs="SimSun" w:hint="eastAsia"/>
+          <w:lang w:val="en-US"/>
+        </w:rPr>
+        <w:t>)</w:t>
+      </w:r>
+    </w:p>
+    <w:p>
+      <w:pPr>
+        <w:rPr>
+          <w:rFonts w:ascii="SimSun" w:eastAsia="SimSun" w:hAnsi="SimSun" w:cs="SimSun"/>
+          <w:lang w:val="en-US"/>
+        </w:rPr>
+      </w:pPr>
+      <w:r>
+        <w:rPr>
+          <w:rFonts w:ascii="SimSun" w:eastAsia="SimSun" w:hAnsi="SimSun" w:cs="SimSun"/>
+          <w:lang w:val="en-US"/>
+        </w:rPr>
+        <w:t>&lt;</w:t>
+      </w:r>
+      <w:r>
+        <w:rPr>
+          <w:rFonts w:ascii="SimSun" w:eastAsia="SimSun" w:hAnsi="SimSun" w:cs="SimSun" w:hint="eastAsia"/>
+          <w:lang w:val="en-US"/>
+        </w:rPr>
+        <w:t>后续</w:t>
+      </w:r>
+      <w:r>
+        <w:rPr>
+          <w:rFonts w:ascii="SimSun" w:eastAsia="SimSun" w:hAnsi="SimSun" w:cs="SimSun"/>
+          <w:lang w:val="en-US"/>
+        </w:rPr>
+        <w:t xml:space="preserve">&gt; </w:t>
+      </w:r>
+      <w:r>
+        <w:rPr>
+          <w:rFonts w:ascii="SimSun" w:eastAsia="SimSun" w:hAnsi="SimSun" w:cs="SimSun" w:hint="eastAsia"/>
+          <w:lang w:val="en-US"/>
+        </w:rPr>
+        <w:t xml:space="preserve">高德地图的湿度数据是实时变化的每次请求得到的原始数据都不同 </w:t>
+      </w:r>
+    </w:p>
+    <w:p>
+      <w:pPr>
+        <w:rPr>
+          <w:lang w:val="en-US"/>
+        </w:rPr>
+      </w:pPr>
+      <w:proofErr w:type="spellStart"/>
+      <w:r>
+        <w:rPr>
+          <w:rFonts w:ascii="SimSun" w:eastAsia="SimSun" w:hAnsi="SimSun" w:cs="SimSun" w:hint="eastAsia"/>
+          <w:lang w:val="en-US"/>
+        </w:rPr>
+        <w:t>top</w:t>
+      </w:r>
+      <w:r>
+        <w:rPr>
+          <w:rFonts w:ascii="SimSun" w:eastAsia="SimSun" w:hAnsi="SimSun" w:cs="SimSun"/>
+          <w:lang w:val="en-US"/>
+        </w:rPr>
+        <w:t>_k</w:t>
+      </w:r>
+      <w:proofErr w:type="spellEnd"/>
+      <w:r>
+        <w:rPr>
+          <w:rFonts w:ascii="SimSun" w:eastAsia="SimSun" w:hAnsi="SimSun" w:cs="SimSun"/>
+          <w:lang w:val="en-US"/>
+        </w:rPr>
+        <w:t xml:space="preserve">=1 </w:t>
+      </w:r>
+      <w:r>
+        <w:rPr>
+          <w:rFonts w:ascii="SimSun" w:eastAsia="SimSun" w:hAnsi="SimSun" w:cs="SimSun" w:hint="eastAsia"/>
+          <w:lang w:val="en-US"/>
+        </w:rPr>
+        <w:t>限制了模型对于温度的体现</w:t>
+      </w:r>
+    </w:p>
+    <w:p>
+      <w:pPr>
+        <w:pStyle w:val="Heading1"/>
+        <w:rPr>
+          <w:lang w:val="en-US"/>
+        </w:rPr>
+      </w:pPr>
+      <w:proofErr w:type="spellStart"/>
+      <w:r>
+        <w:rPr>
+          <w:rFonts w:hint="eastAsia"/>
+          <w:lang w:val="en-US"/>
+        </w:rPr>
+        <w:t>top</w:t>
+      </w:r>
+      <w:r>
+        <w:rPr>
+          <w:lang w:val="en-US"/>
+        </w:rPr>
+        <w:t>_k</w:t>
+      </w:r>
+      <w:proofErr w:type="spellEnd"/>
+      <w:r>
+        <w:rPr>
+          <w:lang w:val="en-US"/>
+        </w:rPr>
+        <w:t>=1</w:t>
+      </w:r>
+    </w:p>
+    <w:p>
+      <w:pPr>
+        <w:rPr>
+          <w:lang w:val="en-US"/>
+        </w:rPr>
+      </w:pPr>
+    </w:p>
+    <w:p>
+      <w:pPr>
+        <w:rPr>
+          <w:rFonts w:eastAsia="SimSun"/>
+          <w:b/>
+          <w:bCs/>
+          <w:lang w:val="en-US"/>
+        </w:rPr>
+      </w:pPr>
+      <w:proofErr w:type="spellStart"/>
+      <w:r>
+        <w:rPr>
+          <w:rFonts w:eastAsia="SimSun"/>
+          <w:b/>
+          <w:bCs/>
+          <w:lang w:val="en-US"/>
+        </w:rPr>
+        <w:t>top_k</w:t>
+      </w:r>
+      <w:proofErr w:type="spellEnd"/>
+      <w:r>
+        <w:rPr>
+          <w:rFonts w:eastAsia="SimSun"/>
+          <w:b/>
+          <w:bCs/>
+          <w:lang w:val="en-US"/>
+        </w:rPr>
+        <w:t xml:space="preserve">=1 </w:t>
+      </w:r>
+      <w:r>
+        <w:rPr>
+          <w:rFonts w:eastAsia="SimSun" w:hint="eastAsia"/>
+          <w:b/>
+          <w:bCs/>
+          <w:lang w:val="en-US"/>
+        </w:rPr>
+        <w:t>参数的作用</w:t>
+      </w:r>
+    </w:p>
+    <w:p>
+      <w:pPr>
+        <w:rPr>
+          <w:rFonts w:eastAsia="SimSun"/>
+          <w:lang w:val="en-US"/>
+        </w:rPr>
+      </w:pPr>
+      <w:proofErr w:type="spellStart"/>
+      <w:r>
+        <w:rPr>
+          <w:rFonts w:eastAsia="SimSun"/>
+          <w:lang w:val="en-US"/>
+        </w:rPr>
+        <w:t>top_k</w:t>
+      </w:r>
+      <w:proofErr w:type="spellEnd"/>
+      <w:r>
+        <w:rPr>
+          <w:rFonts w:eastAsia="SimSun"/>
+          <w:lang w:val="en-US"/>
+        </w:rPr>
+        <w:t xml:space="preserve"> </w:t>
+      </w:r>
+      <w:r>
+        <w:rPr>
+          <w:rFonts w:eastAsia="SimSun" w:hint="eastAsia"/>
+          <w:lang w:val="en-US"/>
+        </w:rPr>
+        <w:t>是大型语言模型（</w:t>
+      </w:r>
+      <w:r>
+        <w:rPr>
+          <w:rFonts w:eastAsia="SimSun"/>
+          <w:lang w:val="en-US"/>
+        </w:rPr>
+        <w:t>LLM</w:t>
+      </w:r>
+      <w:r>
+        <w:rPr>
+          <w:rFonts w:eastAsia="SimSun" w:hint="eastAsia"/>
+          <w:lang w:val="en-US"/>
+        </w:rPr>
+        <w:t>）文本生成中的一个重要参数，控制模型如何选择下一个</w:t>
+      </w:r>
+      <w:r>
+        <w:rPr>
+          <w:rFonts w:eastAsia="SimSun"/>
+          <w:lang w:val="en-US"/>
+        </w:rPr>
+        <w:t xml:space="preserve"> token</w:t>
+      </w:r>
+      <w:r>
+        <w:rPr>
+          <w:rFonts w:eastAsia="SimSun" w:hint="eastAsia"/>
+          <w:lang w:val="en-US"/>
+        </w:rPr>
+        <w:t>。</w:t>
+      </w:r>
+    </w:p>
+    <w:p>
+      <w:pPr>
+        <w:rPr>
+          <w:rFonts w:eastAsia="SimSun"/>
+          <w:lang w:val="en-US"/>
+        </w:rPr>
+      </w:pPr>
+      <w:r>
+        <w:rPr>
+          <w:rFonts w:eastAsia="SimSun" w:hint="eastAsia"/>
+          <w:lang w:val="en-US"/>
+        </w:rPr>
+        <w:t>当</w:t>
+      </w:r>
+      <w:r>
+        <w:rPr>
+          <w:rFonts w:eastAsia="SimSun"/>
+          <w:lang w:val="en-US"/>
+        </w:rPr>
+        <w:t xml:space="preserve"> LLM </w:t>
+      </w:r>
+      <w:r>
+        <w:rPr>
+          <w:rFonts w:eastAsia="SimSun" w:hint="eastAsia"/>
+          <w:lang w:val="en-US"/>
+        </w:rPr>
+        <w:t>生成文本时，对于每个位置，模型会：</w:t>
+      </w:r>
+    </w:p>
+    <w:p>
+      <w:pPr>
+        <w:rPr>
+          <w:rFonts w:eastAsia="SimSun"/>
+          <w:lang w:val="en-US"/>
+        </w:rPr>
+      </w:pPr>
+      <w:r>
+        <w:rPr>
+          <w:rFonts w:eastAsia="SimSun" w:hint="eastAsia"/>
+          <w:lang w:val="en-US"/>
+        </w:rPr>
+        <w:lastRenderedPageBreak/>
+        <w:t>计算概率分布：为词汇表中的每个</w:t>
+      </w:r>
+      <w:r>
+        <w:rPr>
+          <w:rFonts w:eastAsia="SimSun"/>
+          <w:lang w:val="en-US"/>
+        </w:rPr>
+        <w:t xml:space="preserve"> token </w:t>
+      </w:r>
+      <w:r>
+        <w:rPr>
+          <w:rFonts w:eastAsia="SimSun" w:hint="eastAsia"/>
+          <w:lang w:val="en-US"/>
+        </w:rPr>
+        <w:t>计算概率</w:t>
+      </w:r>
+    </w:p>
+    <w:p>
+      <w:pPr>
+        <w:rPr>
+          <w:rFonts w:eastAsia="SimSun"/>
+          <w:lang w:val="en-US"/>
+        </w:rPr>
+      </w:pPr>
+      <w:r>
+        <w:rPr>
+          <w:rFonts w:eastAsia="SimSun" w:hint="eastAsia"/>
+          <w:lang w:val="en-US"/>
+        </w:rPr>
+        <w:t>选择</w:t>
+      </w:r>
+      <w:r>
+        <w:rPr>
+          <w:rFonts w:eastAsia="SimSun"/>
+          <w:lang w:val="en-US"/>
+        </w:rPr>
+        <w:t xml:space="preserve"> token</w:t>
+      </w:r>
+      <w:r>
+        <w:rPr>
+          <w:rFonts w:eastAsia="SimSun" w:hint="eastAsia"/>
+          <w:lang w:val="en-US"/>
+        </w:rPr>
+        <w:t>：根据某种策略选择一个</w:t>
+      </w:r>
+      <w:r>
+        <w:rPr>
+          <w:rFonts w:eastAsia="SimSun"/>
+          <w:lang w:val="en-US"/>
+        </w:rPr>
+        <w:t xml:space="preserve"> token</w:t>
+      </w:r>
+      <w:r>
+        <w:rPr>
+          <w:rFonts w:eastAsia="SimSun"/>
+          <w:lang w:val="en-US"/>
+        </w:rPr>
+        <w:t>.</w:t>
+      </w:r>
+    </w:p>
+    <w:p>
+      <w:pPr>
+        <w:rPr>
+          <w:rFonts w:eastAsia="SimSun"/>
+          <w:lang w:val="en-US"/>
+        </w:rPr>
+      </w:pPr>
+      <w:r>
+        <w:rPr>
+          <w:rFonts w:eastAsia="SimSun" w:hint="eastAsia"/>
+          <w:lang w:val="en-US"/>
+        </w:rPr>
+        <w:t>不使用</w:t>
+      </w:r>
+      <w:r>
+        <w:rPr>
+          <w:rFonts w:eastAsia="SimSun"/>
+          <w:lang w:val="en-US"/>
+        </w:rPr>
+        <w:t xml:space="preserve"> </w:t>
+      </w:r>
+      <w:proofErr w:type="spellStart"/>
+      <w:r>
+        <w:rPr>
+          <w:rFonts w:eastAsia="SimSun"/>
+          <w:lang w:val="en-US"/>
+        </w:rPr>
+        <w:t>top_k</w:t>
+      </w:r>
+      <w:proofErr w:type="spellEnd"/>
+      <w:r>
+        <w:rPr>
+          <w:rFonts w:eastAsia="SimSun"/>
+          <w:lang w:val="en-US"/>
+        </w:rPr>
+        <w:t xml:space="preserve"> </w:t>
+      </w:r>
+      <w:r>
+        <w:rPr>
+          <w:rFonts w:eastAsia="SimSun" w:hint="eastAsia"/>
+          <w:lang w:val="en-US"/>
+        </w:rPr>
+        <w:t>时（默认行为）采样策略：</w:t>
+      </w:r>
+    </w:p>
+    <w:p>
+      <w:pPr>
+        <w:rPr>
+          <w:rFonts w:eastAsia="SimSun"/>
+          <w:lang w:val="en-US"/>
+        </w:rPr>
+      </w:pPr>
+      <w:r>
+        <w:rPr>
+          <w:rFonts w:eastAsia="SimSun" w:hint="eastAsia"/>
+          <w:lang w:val="en-US"/>
+        </w:rPr>
+        <w:t>从所有可能的</w:t>
+      </w:r>
+      <w:r>
+        <w:rPr>
+          <w:rFonts w:eastAsia="SimSun"/>
+          <w:lang w:val="en-US"/>
+        </w:rPr>
+        <w:t xml:space="preserve"> tokens </w:t>
+      </w:r>
+      <w:r>
+        <w:rPr>
+          <w:rFonts w:eastAsia="SimSun" w:hint="eastAsia"/>
+          <w:lang w:val="en-US"/>
+        </w:rPr>
+        <w:t>中按概率采样</w:t>
+      </w:r>
+      <w:r>
+        <w:rPr>
+          <w:rFonts w:eastAsia="SimSun"/>
+          <w:lang w:val="en-US"/>
+        </w:rPr>
+        <w:t xml:space="preserve">m </w:t>
+      </w:r>
+      <w:r>
+        <w:rPr>
+          <w:rFonts w:eastAsia="SimSun" w:hint="eastAsia"/>
+          <w:lang w:val="en-US"/>
+        </w:rPr>
+        <w:t>即使</w:t>
+      </w:r>
+      <w:r>
+        <w:rPr>
+          <w:rFonts w:eastAsia="SimSun"/>
+          <w:lang w:val="en-US"/>
+        </w:rPr>
+        <w:t xml:space="preserve"> probability </w:t>
+      </w:r>
+      <w:r>
+        <w:rPr>
+          <w:rFonts w:eastAsia="SimSun" w:hint="eastAsia"/>
+          <w:lang w:val="en-US"/>
+        </w:rPr>
+        <w:t>很低的</w:t>
+      </w:r>
+      <w:r>
+        <w:rPr>
+          <w:rFonts w:eastAsia="SimSun"/>
+          <w:lang w:val="en-US"/>
+        </w:rPr>
+        <w:t xml:space="preserve"> token </w:t>
+      </w:r>
+      <w:r>
+        <w:rPr>
+          <w:rFonts w:eastAsia="SimSun" w:hint="eastAsia"/>
+          <w:lang w:val="en-US"/>
+        </w:rPr>
+        <w:t>也可能被选中</w:t>
+      </w:r>
+    </w:p>
+    <w:p>
+      <w:pPr>
+        <w:rPr>
+          <w:rFonts w:eastAsia="SimSun"/>
+          <w:lang w:val="en-US"/>
+        </w:rPr>
+      </w:pPr>
+      <w:r>
+        <w:rPr>
+          <w:rFonts w:eastAsia="SimSun" w:hint="eastAsia"/>
+          <w:lang w:val="en-US"/>
+        </w:rPr>
+        <w:t>引入</w:t>
+      </w:r>
+      <w:r>
+        <w:rPr>
+          <w:rFonts w:eastAsia="SimSun"/>
+          <w:lang w:val="en-US"/>
+        </w:rPr>
+        <w:t>temperature</w:t>
+      </w:r>
+      <w:r>
+        <w:rPr>
+          <w:rFonts w:eastAsia="SimSun" w:hint="eastAsia"/>
+          <w:lang w:val="en-US"/>
+        </w:rPr>
+        <w:t>之后即使</w:t>
+      </w:r>
+      <w:r>
+        <w:rPr>
+          <w:rFonts w:eastAsia="SimSun" w:hint="eastAsia"/>
+          <w:lang w:val="en-US"/>
+        </w:rPr>
+        <w:t>temp=0</w:t>
+      </w:r>
+      <w:r>
+        <w:rPr>
+          <w:rFonts w:eastAsia="SimSun" w:hint="eastAsia"/>
+          <w:lang w:val="en-US"/>
+        </w:rPr>
+        <w:t>输出也有可能不同</w:t>
+      </w:r>
+    </w:p>
+    <w:p>
+      <w:pPr>
+        <w:rPr>
+          <w:rFonts w:eastAsia="SimSun"/>
+          <w:lang w:val="en-US"/>
+        </w:rPr>
+      </w:pPr>
+      <w:r>
+        <w:rPr>
+          <w:rFonts w:eastAsia="SimSun" w:hint="eastAsia"/>
+          <w:lang w:val="en-US"/>
+        </w:rPr>
+        <w:t>使用</w:t>
+      </w:r>
+      <w:r>
+        <w:rPr>
+          <w:rFonts w:eastAsia="SimSun"/>
+          <w:lang w:val="en-US"/>
+        </w:rPr>
+        <w:t xml:space="preserve"> </w:t>
+      </w:r>
+      <w:proofErr w:type="spellStart"/>
+      <w:r>
+        <w:rPr>
+          <w:rFonts w:eastAsia="SimSun"/>
+          <w:lang w:val="en-US"/>
+        </w:rPr>
+        <w:t>top_k</w:t>
+      </w:r>
+      <w:proofErr w:type="spellEnd"/>
+      <w:r>
+        <w:rPr>
+          <w:rFonts w:eastAsia="SimSun"/>
+          <w:lang w:val="en-US"/>
+        </w:rPr>
+        <w:t xml:space="preserve">=1 </w:t>
+      </w:r>
+      <w:r>
+        <w:rPr>
+          <w:rFonts w:eastAsia="SimSun" w:hint="eastAsia"/>
+          <w:lang w:val="en-US"/>
+        </w:rPr>
+        <w:t>时模型只从概率最高的</w:t>
+      </w:r>
+      <w:r>
+        <w:rPr>
+          <w:rFonts w:eastAsia="SimSun"/>
+          <w:lang w:val="en-US"/>
+        </w:rPr>
+        <w:t xml:space="preserve"> 1 </w:t>
+      </w:r>
+      <w:r>
+        <w:rPr>
+          <w:rFonts w:eastAsia="SimSun" w:hint="eastAsia"/>
+          <w:lang w:val="en-US"/>
+        </w:rPr>
+        <w:t>个</w:t>
+      </w:r>
+      <w:r>
+        <w:rPr>
+          <w:rFonts w:eastAsia="SimSun"/>
+          <w:lang w:val="en-US"/>
+        </w:rPr>
+        <w:t xml:space="preserve"> token </w:t>
+      </w:r>
+      <w:r>
+        <w:rPr>
+          <w:rFonts w:eastAsia="SimSun" w:hint="eastAsia"/>
+          <w:lang w:val="en-US"/>
+        </w:rPr>
+        <w:t>中选择</w:t>
+      </w:r>
+      <w:r>
+        <w:rPr>
+          <w:rFonts w:eastAsia="SimSun" w:hint="eastAsia"/>
+          <w:lang w:val="en-US"/>
+        </w:rPr>
+        <w:t xml:space="preserve">, </w:t>
+      </w:r>
+      <w:r>
+        <w:rPr>
+          <w:rFonts w:eastAsia="SimSun" w:hint="eastAsia"/>
+          <w:lang w:val="en-US"/>
+        </w:rPr>
+        <w:t>其他所有</w:t>
+      </w:r>
+      <w:r>
+        <w:rPr>
+          <w:rFonts w:eastAsia="SimSun"/>
+          <w:lang w:val="en-US"/>
+        </w:rPr>
+        <w:t xml:space="preserve"> token</w:t>
+      </w:r>
+      <w:r>
+        <w:rPr>
+          <w:rFonts w:eastAsia="SimSun" w:hint="eastAsia"/>
+          <w:lang w:val="en-US"/>
+        </w:rPr>
+        <w:t>（即使概率接近）被完全忽略</w:t>
+      </w:r>
+      <w:r>
+        <w:rPr>
+          <w:rFonts w:eastAsia="SimSun" w:hint="eastAsia"/>
+          <w:lang w:val="en-US"/>
+        </w:rPr>
+        <w:t xml:space="preserve">, </w:t>
+      </w:r>
+      <w:r>
+        <w:rPr>
+          <w:rFonts w:eastAsia="SimSun" w:hint="eastAsia"/>
+          <w:lang w:val="en-US"/>
+        </w:rPr>
+        <w:t>强制选择最可能的输出</w:t>
+      </w:r>
+    </w:p>
+    <w:p>
+      <w:pPr>
+        <w:rPr>
+          <w:rFonts w:eastAsia="SimSun"/>
+          <w:lang w:val="en-US"/>
+        </w:rPr>
+      </w:pPr>
+    </w:p>
+    <w:p>
+      <w:pPr>
+        <w:rPr>
+          <w:rFonts w:eastAsia="SimSun"/>
+          <w:lang w:val="en-US"/>
+        </w:rPr>
+      </w:pPr>
+      <w:r>
+        <w:rPr>
+          <w:rFonts w:ascii="Apple Color Emoji" w:eastAsia="SimSun" w:hAnsi="Apple Color Emoji" w:cs="Apple Color Emoji"/>
+          <w:lang w:val="en-US"/>
+        </w:rPr>
+        <w:t>🎯</w:t>
+      </w:r>
+      <w:r>
+        <w:rPr>
+          <w:rFonts w:eastAsia="SimSun"/>
+          <w:lang w:val="en-US"/>
+        </w:rPr>
+        <w:t xml:space="preserve"> </w:t>
+      </w:r>
+      <w:proofErr w:type="spellStart"/>
+      <w:r>
+        <w:rPr>
+          <w:rFonts w:eastAsia="SimSun"/>
+          <w:lang w:val="en-US"/>
+        </w:rPr>
+        <w:t>top_k</w:t>
+      </w:r>
+      <w:proofErr w:type="spellEnd"/>
+      <w:r>
+        <w:rPr>
+          <w:rFonts w:eastAsia="SimSun"/>
+          <w:lang w:val="en-US"/>
+        </w:rPr>
+        <w:t xml:space="preserve"> </w:t>
+      </w:r>
+      <w:r>
+        <w:rPr>
+          <w:rFonts w:eastAsia="SimSun" w:hint="eastAsia"/>
+          <w:lang w:val="en-US"/>
+        </w:rPr>
+        <w:t>与</w:t>
+      </w:r>
+      <w:r>
+        <w:rPr>
+          <w:rFonts w:eastAsia="SimSun"/>
+          <w:lang w:val="en-US"/>
+        </w:rPr>
+        <w:t xml:space="preserve"> temperature </w:t>
+      </w:r>
+      <w:r>
+        <w:rPr>
+          <w:rFonts w:eastAsia="SimSun" w:hint="eastAsia"/>
+          <w:lang w:val="en-US"/>
+        </w:rPr>
+        <w:t>的关系</w:t>
+      </w:r>
+    </w:p>
+    <w:p>
+      <w:pPr>
+        <w:rPr>
+          <w:rFonts w:eastAsia="SimSun"/>
+          <w:lang w:val="en-US"/>
+        </w:rPr>
+      </w:pPr>
+      <w:r>
+        <w:rPr>
+          <w:rFonts w:eastAsia="SimSun" w:hint="eastAsia"/>
+          <w:lang w:val="en-US"/>
+        </w:rPr>
+        <w:t>参数交互</w:t>
+      </w:r>
+    </w:p>
+    <w:p>
+      <w:pPr>
+        <w:rPr>
+          <w:rFonts w:eastAsia="SimSun"/>
+          <w:lang w:val="en-US"/>
+        </w:rPr>
+      </w:pPr>
+      <w:r>
+        <w:rPr>
+          <w:rFonts w:eastAsia="SimSun"/>
+          <w:lang w:val="en-US"/>
+        </w:rPr>
+        <w:t>Temperature</w:t>
+      </w:r>
+      <w:r>
+        <w:rPr>
+          <w:rFonts w:eastAsia="SimSun"/>
+          <w:lang w:val="en-US"/>
+        </w:rPr>
+        <w:tab/>
+      </w:r>
+      <w:proofErr w:type="spellStart"/>
+      <w:r>
+        <w:rPr>
+          <w:rFonts w:eastAsia="SimSun"/>
+          <w:lang w:val="en-US"/>
+        </w:rPr>
+        <w:t>top_k</w:t>
+      </w:r>
+      <w:proofErr w:type="spellEnd"/>
+      <w:r>
+        <w:rPr>
+          <w:rFonts w:eastAsia="SimSun"/>
+          <w:lang w:val="en-US"/>
+        </w:rPr>
+        <w:tab/>
+      </w:r>
+      <w:r>
+        <w:rPr>
+          <w:rFonts w:eastAsia="SimSun" w:hint="eastAsia"/>
+          <w:lang w:val="en-US"/>
+        </w:rPr>
+        <w:t>效果</w:t>
+      </w:r>
+      <w:r>
+        <w:rPr>
+          <w:rFonts w:eastAsia="SimSun"/>
+          <w:lang w:val="en-US"/>
+        </w:rPr>
+        <w:tab/>
+      </w:r>
+      <w:r>
+        <w:rPr>
+          <w:rFonts w:eastAsia="SimSun" w:hint="eastAsia"/>
+          <w:lang w:val="en-US"/>
+        </w:rPr>
+        <w:t>确定性</w:t>
+      </w:r>
+    </w:p>
+    <w:p>
+      <w:pPr>
+        <w:rPr>
+          <w:rFonts w:eastAsia="SimSun"/>
+          <w:lang w:val="en-US"/>
+        </w:rPr>
+      </w:pPr>
+      <w:r>
+        <w:rPr>
+          <w:rFonts w:eastAsia="SimSun"/>
+          <w:lang w:val="en-US"/>
+        </w:rPr>
+        <w:t>0.0</w:t>
+      </w:r>
+      <w:r>
+        <w:rPr>
+          <w:rFonts w:eastAsia="SimSun"/>
+          <w:lang w:val="en-US"/>
+        </w:rPr>
+        <w:tab/>
+      </w:r>
+      <w:r>
+        <w:rPr>
+          <w:rFonts w:eastAsia="SimSun"/>
+          <w:lang w:val="en-US"/>
+        </w:rPr>
+        <w:tab/>
+      </w:r>
+      <w:r>
+        <w:rPr>
+          <w:rFonts w:eastAsia="SimSun"/>
+          <w:lang w:val="en-US"/>
+        </w:rPr>
+        <w:t>1</w:t>
+      </w:r>
+      <w:r>
+        <w:rPr>
+          <w:rFonts w:eastAsia="SimSun"/>
+          <w:lang w:val="en-US"/>
+        </w:rPr>
+        <w:tab/>
+      </w:r>
+      <w:r>
+        <w:rPr>
+          <w:rFonts w:eastAsia="SimSun" w:hint="eastAsia"/>
+          <w:lang w:val="en-US"/>
+        </w:rPr>
+        <w:t>完全确定性，总是选择最可能的</w:t>
+      </w:r>
+      <w:r>
+        <w:rPr>
+          <w:rFonts w:eastAsia="SimSun"/>
+          <w:lang w:val="en-US"/>
+        </w:rPr>
+        <w:t xml:space="preserve"> token</w:t>
+      </w:r>
+      <w:r>
+        <w:rPr>
+          <w:rFonts w:eastAsia="SimSun"/>
+          <w:lang w:val="en-US"/>
+        </w:rPr>
+        <w:tab/>
+      </w:r>
+      <w:r>
+        <w:rPr>
+          <w:rFonts w:ascii="Apple Color Emoji" w:eastAsia="SimSun" w:hAnsi="Apple Color Emoji" w:cs="Apple Color Emoji"/>
+          <w:lang w:val="en-US"/>
+        </w:rPr>
+        <w:t>⭐⭐⭐⭐⭐</w:t>
+      </w:r>
+    </w:p>
+    <w:p>
+      <w:pPr>
+        <w:rPr>
+          <w:rFonts w:eastAsia="SimSun"/>
+          <w:lang w:val="en-US"/>
+        </w:rPr>
+      </w:pPr>
+      <w:r>
+        <w:rPr>
+          <w:rFonts w:eastAsia="SimSun"/>
+          <w:lang w:val="en-US"/>
+        </w:rPr>
+        <w:t>0.0</w:t>
+      </w:r>
+      <w:r>
+        <w:rPr>
+          <w:rFonts w:eastAsia="SimSun"/>
+          <w:lang w:val="en-US"/>
+        </w:rPr>
+        <w:tab/>
+      </w:r>
+      <w:r>
+        <w:rPr>
+          <w:rFonts w:eastAsia="SimSun"/>
+          <w:lang w:val="en-US"/>
+        </w:rPr>
+        <w:tab/>
+      </w:r>
+      <w:r>
+        <w:rPr>
+          <w:rFonts w:eastAsia="SimSun"/>
+          <w:lang w:val="en-US"/>
+        </w:rPr>
+        <w:t>10</w:t>
+      </w:r>
+      <w:r>
+        <w:rPr>
+          <w:rFonts w:eastAsia="SimSun"/>
+          <w:lang w:val="en-US"/>
+        </w:rPr>
+        <w:tab/>
+      </w:r>
+      <w:r>
+        <w:rPr>
+          <w:rFonts w:eastAsia="SimSun" w:hint="eastAsia"/>
+          <w:lang w:val="en-US"/>
+        </w:rPr>
+        <w:t>低随机性，从</w:t>
+      </w:r>
+      <w:r>
+        <w:rPr>
+          <w:rFonts w:eastAsia="SimSun"/>
+          <w:lang w:val="en-US"/>
+        </w:rPr>
+        <w:t xml:space="preserve"> top 10 </w:t>
+      </w:r>
+      <w:r>
+        <w:rPr>
+          <w:rFonts w:eastAsia="SimSun" w:hint="eastAsia"/>
+          <w:lang w:val="en-US"/>
+        </w:rPr>
+        <w:t>中采样</w:t>
+      </w:r>
+      <w:r>
+        <w:rPr>
+          <w:rFonts w:eastAsia="SimSun"/>
+          <w:lang w:val="en-US"/>
+        </w:rPr>
+        <w:tab/>
+      </w:r>
+      <w:r>
+        <w:rPr>
+          <w:rFonts w:ascii="Apple Color Emoji" w:eastAsia="SimSun" w:hAnsi="Apple Color Emoji" w:cs="Apple Color Emoji"/>
+          <w:lang w:val="en-US"/>
+        </w:rPr>
+        <w:t>⭐⭐⭐</w:t>
+      </w:r>
+    </w:p>
+    <w:p>
+      <w:pPr>
+        <w:rPr>
+          <w:rFonts w:eastAsia="SimSun"/>
+          <w:lang w:val="en-US"/>
+        </w:rPr>
+      </w:pPr>
+      <w:r>
+        <w:rPr>
+          <w:rFonts w:eastAsia="SimSun"/>
+          <w:lang w:val="en-US"/>
+        </w:rPr>
+        <w:t>0.5</w:t>
+      </w:r>
+      <w:r>
+        <w:rPr>
+          <w:rFonts w:eastAsia="SimSun"/>
+          <w:lang w:val="en-US"/>
+        </w:rPr>
+        <w:tab/>
+      </w:r>
+      <w:r>
+        <w:rPr>
+          <w:rFonts w:eastAsia="SimSun"/>
+          <w:lang w:val="en-US"/>
+        </w:rPr>
+        <w:tab/>
+      </w:r>
+      <w:r>
+        <w:rPr>
+          <w:rFonts w:eastAsia="SimSun"/>
+          <w:lang w:val="en-US"/>
+        </w:rPr>
+        <w:t>1</w:t>
+      </w:r>
+      <w:r>
+        <w:rPr>
+          <w:rFonts w:eastAsia="SimSun"/>
+          <w:lang w:val="en-US"/>
+        </w:rPr>
+        <w:tab/>
+      </w:r>
+      <w:r>
+        <w:rPr>
+          <w:rFonts w:eastAsia="SimSun" w:hint="eastAsia"/>
+          <w:lang w:val="en-US"/>
+        </w:rPr>
+        <w:t>强制选择最可能的，但温度影响排序</w:t>
+      </w:r>
+      <w:r>
+        <w:rPr>
+          <w:rFonts w:eastAsia="SimSun"/>
+          <w:lang w:val="en-US"/>
+        </w:rPr>
+        <w:tab/>
+      </w:r>
+      <w:r>
+        <w:rPr>
+          <w:rFonts w:ascii="Apple Color Emoji" w:eastAsia="SimSun" w:hAnsi="Apple Color Emoji" w:cs="Apple Color Emoji"/>
+          <w:lang w:val="en-US"/>
+        </w:rPr>
+        <w:t>⭐⭐⭐⭐</w:t>
+      </w:r>
+    </w:p>
+    <w:p>
+      <w:pPr>
+        <w:rPr>
+          <w:rFonts w:eastAsia="SimSun"/>
+          <w:lang w:val="en-US"/>
+        </w:rPr>
+      </w:pPr>
+      <w:r>
+        <w:rPr>
+          <w:rFonts w:eastAsia="SimSun"/>
+          <w:lang w:val="en-US"/>
+        </w:rPr>
+        <w:t>0.5</w:t>
+      </w:r>
+      <w:r>
+        <w:rPr>
+          <w:rFonts w:eastAsia="SimSun"/>
+          <w:lang w:val="en-US"/>
+        </w:rPr>
+        <w:tab/>
+      </w:r>
+      <w:r>
+        <w:rPr>
+          <w:rFonts w:eastAsia="SimSun"/>
+          <w:lang w:val="en-US"/>
+        </w:rPr>
+        <w:tab/>
+      </w:r>
+      <w:r>
+        <w:rPr>
+          <w:rFonts w:eastAsia="SimSun"/>
+          <w:lang w:val="en-US"/>
+        </w:rPr>
+        <w:t>10</w:t>
+      </w:r>
+      <w:r>
+        <w:rPr>
+          <w:rFonts w:eastAsia="SimSun"/>
+          <w:lang w:val="en-US"/>
+        </w:rPr>
+        <w:tab/>
+      </w:r>
+      <w:r>
+        <w:rPr>
+          <w:rFonts w:eastAsia="SimSun" w:hint="eastAsia"/>
+          <w:lang w:val="en-US"/>
+        </w:rPr>
+        <w:t>中等随机性，温度</w:t>
+      </w:r>
+      <w:r>
+        <w:rPr>
+          <w:rFonts w:eastAsia="SimSun"/>
+          <w:lang w:val="en-US"/>
+        </w:rPr>
+        <w:t xml:space="preserve"> + </w:t>
+      </w:r>
+      <w:r>
+        <w:rPr>
+          <w:rFonts w:eastAsia="SimSun" w:hint="eastAsia"/>
+          <w:lang w:val="en-US"/>
+        </w:rPr>
+        <w:t>采样</w:t>
+      </w:r>
+      <w:r>
+        <w:rPr>
+          <w:rFonts w:eastAsia="SimSun"/>
+          <w:lang w:val="en-US"/>
+        </w:rPr>
+        <w:tab/>
+      </w:r>
+      <w:r>
+        <w:rPr>
+          <w:rFonts w:ascii="Apple Color Emoji" w:eastAsia="SimSun" w:hAnsi="Apple Color Emoji" w:cs="Apple Color Emoji"/>
+          <w:lang w:val="en-US"/>
+        </w:rPr>
+        <w:t>⭐⭐</w:t>
+      </w:r>
+    </w:p>
+    <w:p>
+      <w:pPr>
+        <w:rPr>
+          <w:rFonts w:eastAsia="SimSun"/>
+          <w:lang w:val="en-US"/>
+        </w:rPr>
+      </w:pPr>
+      <w:r>
+        <w:rPr>
+          <w:rFonts w:eastAsia="SimSun"/>
+          <w:lang w:val="en-US"/>
+        </w:rPr>
+        <w:t>1.0</w:t>
+      </w:r>
+      <w:r>
+        <w:rPr>
+          <w:rFonts w:eastAsia="SimSun"/>
+          <w:lang w:val="en-US"/>
+        </w:rPr>
+        <w:tab/>
+      </w:r>
+      <w:r>
+        <w:rPr>
+          <w:rFonts w:eastAsia="SimSun"/>
+          <w:lang w:val="en-US"/>
+        </w:rPr>
+        <w:tab/>
+      </w:r>
+      <w:r>
+        <w:rPr>
+          <w:rFonts w:eastAsia="SimSun"/>
+          <w:lang w:val="en-US"/>
+        </w:rPr>
+        <w:t>1</w:t>
+      </w:r>
+      <w:r>
+        <w:rPr>
+          <w:rFonts w:eastAsia="SimSun"/>
+          <w:lang w:val="en-US"/>
+        </w:rPr>
+        <w:tab/>
+      </w:r>
+      <w:r>
+        <w:rPr>
+          <w:rFonts w:eastAsia="SimSun" w:hint="eastAsia"/>
+          <w:lang w:val="en-US"/>
+        </w:rPr>
+        <w:t>高随机性，温度影响排序</w:t>
+      </w:r>
+      <w:r>
+        <w:rPr>
+          <w:rFonts w:eastAsia="SimSun"/>
+          <w:lang w:val="en-US"/>
+        </w:rPr>
+        <w:tab/>
+      </w:r>
+      <w:r>
+        <w:rPr>
+          <w:rFonts w:ascii="Apple Color Emoji" w:eastAsia="SimSun" w:hAnsi="Apple Color Emoji" w:cs="Apple Color Emoji"/>
+          <w:lang w:val="en-US"/>
+        </w:rPr>
+        <w:t>⭐⭐⭐</w:t>
+      </w:r>
+    </w:p>
+    <w:p>
+      <w:pPr>
+        <w:rPr>
+          <w:rFonts w:eastAsia="SimSun"/>
+          <w:lang w:val="en-US"/>
+        </w:rPr>
+      </w:pPr>
+      <w:r>
+        <w:rPr>
+          <w:rFonts w:eastAsia="SimSun"/>
+          <w:lang w:val="en-US"/>
+        </w:rPr>
+        <w:t>1.0</w:t>
+      </w:r>
+      <w:r>
+        <w:rPr>
+          <w:rFonts w:eastAsia="SimSun"/>
+          <w:lang w:val="en-US"/>
+        </w:rPr>
+        <w:tab/>
+        <w:t>1</w:t>
+      </w:r>
+      <w:r>
+        <w:rPr>
+          <w:rFonts w:eastAsia="SimSun"/>
+          <w:lang w:val="en-US"/>
+        </w:rPr>
+        <w:tab/>
+      </w:r>
+      <w:r>
+        <w:rPr>
+          <w:rFonts w:eastAsia="SimSun"/>
+          <w:lang w:val="en-US"/>
+        </w:rPr>
+        <w:t>0</w:t>
+      </w:r>
+      <w:r>
+        <w:rPr>
+          <w:rFonts w:eastAsia="SimSun"/>
+          <w:lang w:val="en-US"/>
+        </w:rPr>
+        <w:tab/>
+      </w:r>
+      <w:r>
+        <w:rPr>
+          <w:rFonts w:eastAsia="SimSun" w:hint="eastAsia"/>
+          <w:lang w:val="en-US"/>
+        </w:rPr>
+        <w:t>最高随机性，温度</w:t>
+      </w:r>
+      <w:r>
+        <w:rPr>
+          <w:rFonts w:eastAsia="SimSun"/>
+          <w:lang w:val="en-US"/>
+        </w:rPr>
+        <w:t xml:space="preserve"> + </w:t>
+      </w:r>
+      <w:r>
+        <w:rPr>
+          <w:rFonts w:eastAsia="SimSun" w:hint="eastAsia"/>
+          <w:lang w:val="en-US"/>
+        </w:rPr>
+        <w:t>采样</w:t>
+      </w:r>
+      <w:r>
+        <w:rPr>
+          <w:rFonts w:eastAsia="SimSun"/>
+          <w:lang w:val="en-US"/>
+        </w:rPr>
+        <w:tab/>
+      </w:r>
+      <w:r>
+        <w:rPr>
+          <w:rFonts w:ascii="Apple Color Emoji" w:eastAsia="SimSun" w:hAnsi="Apple Color Emoji" w:cs="Apple Color Emoji"/>
+          <w:lang w:val="en-US"/>
+        </w:rPr>
+        <w:t>⭐</w:t>
+      </w:r>
+    </w:p>
+    <w:p>
+      <w:pPr>
+        <w:rPr>
+          <w:rFonts w:ascii="Apple Color Emoji" w:eastAsia="SimSun" w:hAnsi="Apple Color Emoji" w:cs="Apple Color Emoji"/>
+          <w:lang w:val="en-US"/>
+        </w:rPr>
+      </w:pPr>
+      <w:r>
+        <w:rPr>
+          <w:rFonts w:eastAsia="SimSun" w:hint="eastAsia"/>
+          <w:lang w:val="en-US"/>
+        </w:rPr>
+        <w:t>来确保</w:t>
+      </w:r>
+      <w:r>
+        <w:rPr>
+          <w:rFonts w:eastAsia="SimSun"/>
+          <w:lang w:val="en-US"/>
+        </w:rPr>
+        <w:t xml:space="preserve"> Temperature 0.0 </w:t>
+      </w:r>
+      <w:r>
+        <w:rPr>
+          <w:rFonts w:eastAsia="SimSun" w:hint="eastAsia"/>
+          <w:lang w:val="en-US"/>
+        </w:rPr>
+        <w:t>的完全确定性！</w:t>
+      </w:r>
+      <w:r>
+        <w:rPr>
+          <w:rFonts w:eastAsia="SimSun"/>
+          <w:lang w:val="en-US"/>
+        </w:rPr>
+        <w:t xml:space="preserve"> </w:t>
+      </w:r>
+      <w:r>
+        <w:rPr>
+          <w:rFonts w:ascii="Apple Color Emoji" w:eastAsia="SimSun" w:hAnsi="Apple Color Emoji" w:cs="Apple Color Emoji"/>
+          <w:lang w:val="en-US"/>
+        </w:rPr>
+        <w:t>🎯</w:t>
+      </w:r>
+    </w:p>
+    <w:p>
+      <w:pPr>
+        <w:rPr>
+          <w:rFonts w:ascii="Apple Color Emoji" w:eastAsia="SimSun" w:hAnsi="Apple Color Emoji" w:cs="Apple Color Emoji"/>
+          <w:lang w:val="en-US"/>
+        </w:rPr>
+      </w:pPr>
+    </w:p>
+    <w:p>
+      <w:pPr>
+        <w:rPr>
+          <w:rFonts w:ascii="Cambria" w:eastAsia="SimSun" w:hAnsi="Cambria" w:cs="Cambria"/>
+          <w:lang w:val="en-US"/>
+        </w:rPr>
+      </w:pPr>
+      <w:r>
+        <w:rPr>
+          <w:rFonts w:ascii="Cambria" w:eastAsia="SimSun" w:hAnsi="Cambria" w:cs="Cambria" w:hint="eastAsia"/>
+          <w:lang w:val="en-US"/>
+        </w:rPr>
+        <w:t>来自知乎</w:t>
+      </w:r>
+      <w:r>
+        <w:rPr>
+          <w:rFonts w:ascii="Cambria" w:eastAsia="SimSun" w:hAnsi="Cambria" w:cs="Cambria" w:hint="eastAsia"/>
+          <w:lang w:val="en-US"/>
+        </w:rPr>
+        <w:t>:</w:t>
+      </w:r>
+    </w:p>
+    <w:p>
+      <w:pPr>
+        <w:rPr>
+          <w:rFonts w:ascii="Cambria" w:eastAsia="SimSun" w:hAnsi="Cambria" w:cs="Cambria"/>
+          <w:lang w:val="en-US"/>
+        </w:rPr>
+      </w:pPr>
+      <w:r>
+        <w:rPr>
+          <w:rFonts w:ascii="Cambria" w:eastAsia="SimSun" w:hAnsi="Cambria" w:cs="Cambria" w:hint="eastAsia"/>
+          <w:lang w:val="en-US"/>
+        </w:rPr>
+        <w:t>Temperature</w:t>
+      </w:r>
+      <w:r>
+        <w:rPr>
+          <w:rFonts w:ascii="Cambria" w:eastAsia="SimSun" w:hAnsi="Cambria" w:cs="Cambria" w:hint="eastAsia"/>
+          <w:lang w:val="en-US"/>
+        </w:rPr>
+        <w:t>和</w:t>
+      </w:r>
+      <w:proofErr w:type="spellStart"/>
+      <w:r>
+        <w:rPr>
+          <w:rFonts w:ascii="Cambria" w:eastAsia="SimSun" w:hAnsi="Cambria" w:cs="Cambria" w:hint="eastAsia"/>
+          <w:lang w:val="en-US"/>
+        </w:rPr>
+        <w:t>top</w:t>
+      </w:r>
+      <w:r>
+        <w:rPr>
+          <w:rFonts w:ascii="Cambria" w:eastAsia="SimSun" w:hAnsi="Cambria" w:cs="Cambria"/>
+          <w:lang w:val="en-US"/>
+        </w:rPr>
+        <w:t>_p</w:t>
+      </w:r>
+      <w:proofErr w:type="spellEnd"/>
+      <w:r>
+        <w:rPr>
+          <w:rFonts w:ascii="Cambria" w:eastAsia="SimSun" w:hAnsi="Cambria" w:cs="Cambria"/>
+          <w:lang w:val="en-US"/>
+        </w:rPr>
+        <w:t xml:space="preserve"> </w:t>
+      </w:r>
+      <w:proofErr w:type="spellStart"/>
+      <w:r>
+        <w:rPr>
+          <w:rFonts w:ascii="Cambria" w:eastAsia="SimSun" w:hAnsi="Cambria" w:cs="Cambria"/>
+          <w:lang w:val="en-US"/>
+        </w:rPr>
+        <w:t>top_k</w:t>
+      </w:r>
+      <w:proofErr w:type="spellEnd"/>
+      <w:r>
+        <w:rPr>
+          <w:rFonts w:ascii="Cambria" w:eastAsia="SimSun" w:hAnsi="Cambria" w:cs="Cambria"/>
+          <w:lang w:val="en-US"/>
+        </w:rPr>
+        <w:t xml:space="preserve"> </w:t>
+      </w:r>
+      <w:r>
+        <w:rPr>
+          <w:rFonts w:ascii="Cambria" w:eastAsia="SimSun" w:hAnsi="Cambria" w:cs="Cambria" w:hint="eastAsia"/>
+          <w:lang w:val="en-US"/>
+        </w:rPr>
+        <w:t>区别</w:t>
+      </w:r>
+    </w:p>
+    <w:p>
+      <w:pPr>
+        <w:rPr>
+          <w:rFonts w:eastAsia="SimSun"/>
+          <w:lang w:val="en-US"/>
+        </w:rPr>
+      </w:pPr>
+      <w:r>
+        <w:rPr>
+          <w:rFonts w:eastAsia="SimSun"/>
+          <w:lang w:val="en-US"/>
+        </w:rPr>
+        <w:t>https://zhuanlan.zhihu.com/p/2021266113950953859</w:t>
+      </w:r>
+    </w:p>
+    <w:p>
+      <w:pPr>
+        <w:rPr>
+          <w:rFonts w:eastAsia="SimSun"/>
+          <w:lang w:val="en-US"/>
+        </w:rPr>
+      </w:pPr>
+    </w:p>
+    <w:p>
+      <w:pPr>
+        <w:rPr>
+          <w:rFonts w:eastAsia="SimSun"/>
+          <w:i/>
+          <w:iCs/>
+          <w:lang w:val="en-US"/>
+        </w:rPr>
+      </w:pPr>
+      <w:r>
+        <w:rPr>
+          <w:rFonts w:eastAsia="SimSun" w:hint="eastAsia"/>
+          <w:i/>
+          <w:iCs/>
+          <w:lang w:val="en-US"/>
+        </w:rPr>
+        <w:t>验收问题测试</w:t>
+      </w:r>
+    </w:p>
+    <w:p>
+      <w:pPr>
+        <w:rPr>
+          <w:rFonts w:eastAsia="SimSun"/>
+          <w:lang w:val="en-US"/>
+        </w:rPr>
+      </w:pPr>
+    </w:p>
+    <w:p>
+      <w:pPr>
+        <w:rPr>
+          <w:rFonts w:eastAsia="SimSun"/>
+          <w:lang w:val="en-US"/>
+        </w:rPr>
+      </w:pPr>
+      <w:r>
+        <w:rPr>
+          <w:rFonts w:eastAsia="SimSun" w:hint="eastAsia"/>
+          <w:lang w:val="en-US"/>
+        </w:rPr>
+        <w:t>请输入问题（或输入</w:t>
+      </w:r>
+      <w:r>
+        <w:rPr>
+          <w:rFonts w:eastAsia="SimSun"/>
+          <w:lang w:val="en-US"/>
+        </w:rPr>
+        <w:t xml:space="preserve"> help/quit</w:t>
+      </w:r>
+      <w:r>
+        <w:rPr>
+          <w:rFonts w:eastAsia="SimSun" w:hint="eastAsia"/>
+          <w:lang w:val="en-US"/>
+        </w:rPr>
+        <w:t>）</w:t>
+      </w:r>
+      <w:r>
+        <w:rPr>
+          <w:rFonts w:eastAsia="SimSun"/>
+          <w:lang w:val="en-US"/>
+        </w:rPr>
+        <w:t xml:space="preserve">: </w:t>
+      </w:r>
+      <w:r>
+        <w:rPr>
+          <w:rFonts w:eastAsia="SimSun" w:hint="eastAsia"/>
+          <w:lang w:val="en-US"/>
+        </w:rPr>
+        <w:t>刚才我问了你哪些问题？</w:t>
+      </w:r>
+    </w:p>
+    <w:p>
+      <w:pPr>
+        <w:rPr>
+          <w:rFonts w:eastAsia="SimSun"/>
+          <w:lang w:val="en-US"/>
+        </w:rPr>
+      </w:pPr>
+      <w:r>
+        <w:rPr>
+          <w:rFonts w:ascii="Apple Color Emoji" w:eastAsia="SimSun" w:hAnsi="Apple Color Emoji" w:cs="Apple Color Emoji"/>
+          <w:lang w:val="en-US"/>
+        </w:rPr>
+        <w:t>📡</w:t>
+      </w:r>
+      <w:r>
+        <w:rPr>
+          <w:rFonts w:eastAsia="SimSun"/>
+          <w:lang w:val="en-US"/>
+        </w:rPr>
+        <w:t xml:space="preserve"> </w:t>
+      </w:r>
+      <w:r>
+        <w:rPr>
+          <w:rFonts w:eastAsia="SimSun" w:hint="eastAsia"/>
+          <w:lang w:val="en-US"/>
+        </w:rPr>
+        <w:t>正在调用</w:t>
+      </w:r>
+      <w:r>
+        <w:rPr>
+          <w:rFonts w:eastAsia="SimSun"/>
+          <w:lang w:val="en-US"/>
+        </w:rPr>
+        <w:t xml:space="preserve"> AI...</w:t>
+      </w:r>
+    </w:p>
+    <w:p>
+      <w:pPr>
+        <w:rPr>
+          <w:rFonts w:eastAsia="SimSun"/>
+          <w:lang w:val="en-US"/>
+        </w:rPr>
+      </w:pPr>
+      <w:r>
+        <w:rPr>
+          <w:rFonts w:ascii="Apple Color Emoji" w:eastAsia="SimSun" w:hAnsi="Apple Color Emoji" w:cs="Apple Color Emoji"/>
+          <w:lang w:val="en-US"/>
+        </w:rPr>
+        <w:t>🧠</w:t>
+      </w:r>
+      <w:r>
+        <w:rPr>
+          <w:rFonts w:eastAsia="SimSun"/>
+          <w:lang w:val="en-US"/>
+        </w:rPr>
+        <w:t xml:space="preserve"> </w:t>
+      </w:r>
+      <w:r>
+        <w:rPr>
+          <w:rFonts w:eastAsia="SimSun" w:hint="eastAsia"/>
+          <w:lang w:val="en-US"/>
+        </w:rPr>
+        <w:t>思考模式：</w:t>
+      </w:r>
+      <w:r>
+        <w:rPr>
+          <w:rFonts w:ascii="Apple Color Emoji" w:eastAsia="SimSun" w:hAnsi="Apple Color Emoji" w:cs="Apple Color Emoji"/>
+          <w:lang w:val="en-US"/>
+        </w:rPr>
+        <w:t>❌</w:t>
+      </w:r>
+      <w:r>
+        <w:rPr>
+          <w:rFonts w:eastAsia="SimSun"/>
+          <w:lang w:val="en-US"/>
+        </w:rPr>
+        <w:t xml:space="preserve"> </w:t>
+      </w:r>
+      <w:r>
+        <w:rPr>
+          <w:rFonts w:eastAsia="SimSun" w:hint="eastAsia"/>
+          <w:lang w:val="en-US"/>
+        </w:rPr>
+        <w:t>未启用（快速回答模式）</w:t>
+      </w:r>
+    </w:p>
+    <w:p>
+      <w:pPr>
+        <w:rPr>
+          <w:rFonts w:eastAsia="SimSun"/>
+          <w:lang w:val="en-US"/>
+        </w:rPr>
+      </w:pPr>
+      <w:r>
+        <w:rPr>
+          <w:rFonts w:ascii="Apple Color Emoji" w:eastAsia="SimSun" w:hAnsi="Apple Color Emoji" w:cs="Apple Color Emoji"/>
+          <w:lang w:val="en-US"/>
+        </w:rPr>
+        <w:t>💬</w:t>
+      </w:r>
+      <w:r>
+        <w:rPr>
+          <w:rFonts w:eastAsia="SimSun"/>
+          <w:lang w:val="en-US"/>
+        </w:rPr>
+        <w:t xml:space="preserve"> AI </w:t>
+      </w:r>
+      <w:r>
+        <w:rPr>
+          <w:rFonts w:eastAsia="SimSun" w:hint="eastAsia"/>
+          <w:lang w:val="en-US"/>
+        </w:rPr>
+        <w:t>直接回复（未调用工具）</w:t>
+      </w:r>
+    </w:p>
+    <w:p>
+      <w:pPr>
+        <w:rPr>
+          <w:rFonts w:eastAsia="SimSun"/>
+          <w:lang w:val="en-US"/>
+        </w:rPr>
+      </w:pPr>
+      <w:r>
+        <w:rPr>
+          <w:rFonts w:ascii="Apple Color Emoji" w:eastAsia="SimSun" w:hAnsi="Apple Color Emoji" w:cs="Apple Color Emoji"/>
+          <w:lang w:val="en-US"/>
+        </w:rPr>
+        <w:t>🤖</w:t>
+      </w:r>
+      <w:r>
+        <w:rPr>
+          <w:rFonts w:eastAsia="SimSun"/>
+          <w:lang w:val="en-US"/>
+        </w:rPr>
+        <w:t xml:space="preserve"> AI: </w:t>
+      </w:r>
+      <w:r>
+        <w:rPr>
+          <w:rFonts w:eastAsia="SimSun" w:hint="eastAsia"/>
+          <w:lang w:val="en-US"/>
+        </w:rPr>
+        <w:t>您刚才并没有提出具体的问题。如果您有任何问题或需要帮助，可以随时告诉我！无论是关于天气、路线规划还是其他信息查询等，我都会尽力提供帮助。请告诉我您现在想了解的内容吧。</w:t>
+      </w:r>
+    </w:p>
+    <w:p>
+      <w:pPr>
+        <w:rPr>
+          <w:rFonts w:eastAsia="SimSun"/>
+          <w:lang w:val="en-US"/>
+        </w:rPr>
+      </w:pPr>
+    </w:p>
+    <w:p>
+      <w:pPr>
+        <w:rPr>
+          <w:rFonts w:eastAsia="SimSun"/>
+          <w:lang w:val="en-US"/>
+        </w:rPr>
+      </w:pPr>
+      <w:r>
+        <w:rPr>
+          <w:rFonts w:eastAsia="SimSun" w:hint="eastAsia"/>
+          <w:lang w:val="en-US"/>
+        </w:rPr>
+        <w:t>(</w:t>
+      </w:r>
+      <w:r>
+        <w:rPr>
+          <w:rFonts w:eastAsia="SimSun" w:hint="eastAsia"/>
+          <w:lang w:val="en-US"/>
+        </w:rPr>
+        <w:t>我傻了</w:t>
+      </w:r>
+      <w:r>
+        <w:rPr>
+          <w:rFonts w:eastAsia="SimSun"/>
+          <w:lang w:val="en-US"/>
+        </w:rPr>
+        <w:t>…</w:t>
+      </w:r>
+      <w:r>
+        <w:rPr>
+          <w:rFonts w:eastAsia="SimSun" w:hint="eastAsia"/>
+          <w:lang w:val="en-US"/>
+        </w:rPr>
+        <w:t>)</w:t>
+      </w:r>
+    </w:p>
+    <w:p>
+      <w:pPr>
+        <w:rPr>
+          <w:rFonts w:eastAsia="SimSun"/>
+          <w:lang w:val="en-US"/>
+        </w:rPr>
+      </w:pPr>
+      <w:r>
+        <w:rPr>
+          <w:rFonts w:eastAsia="SimSun" w:hint="eastAsia"/>
+          <w:lang w:val="en-US"/>
+        </w:rPr>
+        <w:t>原来</w:t>
+      </w:r>
+      <w:r>
+        <w:rPr>
+          <w:rFonts w:eastAsia="SimSun" w:hint="eastAsia"/>
+          <w:lang w:val="en-US"/>
+        </w:rPr>
+        <w:t>:</w:t>
+      </w:r>
+    </w:p>
+    <w:p>
+      <w:pPr>
+        <w:rPr>
+          <w:rFonts w:eastAsia="SimSun"/>
+          <w:lang w:val="en-US"/>
+        </w:rPr>
+      </w:pPr>
+      <w:r>
+        <w:rPr>
+          <w:rFonts w:eastAsia="SimSun" w:hint="eastAsia"/>
+          <w:lang w:val="en-US"/>
+        </w:rPr>
+        <w:t>main</w:t>
+      </w:r>
+      <w:r>
+        <w:rPr>
+          <w:rFonts w:eastAsia="SimSun"/>
+          <w:lang w:val="en-US"/>
+        </w:rPr>
+        <w:t xml:space="preserve">.py </w:t>
+      </w:r>
+      <w:r>
+        <w:rPr>
+          <w:rFonts w:eastAsia="SimSun" w:hint="eastAsia"/>
+          <w:lang w:val="en-US"/>
+        </w:rPr>
+        <w:t>中虽然记录聊天对话历史</w:t>
+      </w:r>
+      <w:r>
+        <w:rPr>
+          <w:rFonts w:eastAsia="SimSun" w:hint="eastAsia"/>
+          <w:lang w:val="en-US"/>
+        </w:rPr>
+        <w:t xml:space="preserve"> </w:t>
+      </w:r>
+      <w:r>
+        <w:rPr>
+          <w:rFonts w:eastAsia="SimSun" w:hint="eastAsia"/>
+          <w:lang w:val="en-US"/>
+        </w:rPr>
+        <w:t>但是没有传递给</w:t>
+      </w:r>
+      <w:r>
+        <w:rPr>
+          <w:rFonts w:eastAsia="SimSun" w:hint="eastAsia"/>
+          <w:lang w:val="en-US"/>
+        </w:rPr>
+        <w:t>API</w:t>
+      </w:r>
+    </w:p>
+    <w:p>
+      <w:pPr>
+        <w:rPr>
+          <w:rFonts w:eastAsia="SimSun"/>
+          <w:lang w:val="en-US"/>
+        </w:rPr>
+      </w:pPr>
+    </w:p>
+    <w:p>
+      <w:pPr>
+        <w:rPr>
+          <w:rFonts w:eastAsia="SimSun"/>
+          <w:lang w:val="en-US"/>
+        </w:rPr>
+      </w:pPr>
+      <w:r>
+        <w:rPr>
+          <w:rFonts w:eastAsia="SimSun"/>
+          <w:lang w:val="en-US"/>
+        </w:rPr>
+        <w:t xml:space="preserve">6.11&amp;6.12 </w:t>
+      </w:r>
+      <w:r>
+        <w:rPr>
+          <w:rFonts w:eastAsia="SimSun" w:hint="eastAsia"/>
+          <w:lang w:val="en-US"/>
+        </w:rPr>
+        <w:t>撰写测试报告</w:t>
+      </w:r>
+    </w:p>
+    <w:p>
+      <w:pPr>
+        <w:rPr>
+          <w:rFonts w:eastAsia="SimSun"/>
+          <w:lang w:val="en-US"/>
+        </w:rPr>
+      </w:pPr>
+      <w:r>
+        <w:rPr>
+          <w:rFonts w:eastAsia="SimSun" w:hint="eastAsia"/>
+          <w:lang w:val="en-US"/>
+        </w:rPr>
+        <w:t>之前的流式输出功能为硬编码</w:t>
+      </w:r>
+      <w:r>
+        <w:rPr>
+          <w:rFonts w:eastAsia="SimSun" w:hint="eastAsia"/>
+          <w:lang w:val="en-US"/>
+        </w:rPr>
+        <w:t xml:space="preserve"> </w:t>
+      </w:r>
+      <w:r>
+        <w:rPr>
+          <w:rFonts w:eastAsia="SimSun" w:hint="eastAsia"/>
+          <w:lang w:val="en-US"/>
+        </w:rPr>
+        <w:t>无法选择</w:t>
+      </w:r>
+      <w:r>
+        <w:rPr>
+          <w:rFonts w:eastAsia="SimSun" w:hint="eastAsia"/>
+          <w:lang w:val="en-US"/>
+        </w:rPr>
+        <w:t xml:space="preserve">, </w:t>
+      </w:r>
+      <w:r>
+        <w:rPr>
+          <w:rFonts w:eastAsia="SimSun" w:hint="eastAsia"/>
+          <w:lang w:val="en-US"/>
+        </w:rPr>
+        <w:t>加入选择流式</w:t>
+      </w:r>
+      <w:r>
+        <w:rPr>
+          <w:rFonts w:eastAsia="SimSun" w:hint="eastAsia"/>
+          <w:lang w:val="en-US"/>
+        </w:rPr>
+        <w:t>/</w:t>
+      </w:r>
+      <w:r>
+        <w:rPr>
+          <w:rFonts w:eastAsia="SimSun" w:hint="eastAsia"/>
+          <w:lang w:val="en-US"/>
+        </w:rPr>
+        <w:t>非流式输出的功能</w:t>
+      </w:r>
+      <w:r>
+        <w:rPr>
+          <w:rFonts w:eastAsia="SimSun" w:hint="eastAsia"/>
+          <w:lang w:val="en-US"/>
+        </w:rPr>
+        <w:t>.</w:t>
+      </w:r>
+    </w:p>
+    <w:p>
+      <w:pPr>
+        <w:rPr>
+          <w:rFonts w:eastAsia="SimSun"/>
+          <w:lang w:val="en-US"/>
+        </w:rPr>
+      </w:pPr>
+    </w:p>
+    <w:p>
+      <w:pPr>
+        <w:rPr>
+          <w:rFonts w:eastAsia="SimSun"/>
+          <w:lang w:val="en-US"/>
+        </w:rPr>
+      </w:pPr>
+      <w:r>
+        <w:rPr>
+          <w:rFonts w:eastAsia="SimSun" w:hint="eastAsia"/>
+          <w:lang w:val="en-US"/>
+        </w:rPr>
+        <w:t>新增日志记录函数</w:t>
+      </w:r>
+    </w:p>
+    <w:p>
+      <w:pPr>
+        <w:rPr>
+          <w:rFonts w:eastAsia="SimSun" w:hint="eastAsia"/>
+          <w:lang w:val="en-US"/>
+        </w:rPr>
+      </w:pPr>
+    </w:p>
+    <w:p>
+      <w:pPr>
+        <w:rPr>
+          <w:rFonts w:eastAsia="SimSun"/>
+          <w:lang w:val="en-US"/>
+        </w:rPr>
+      </w:pPr>
+      <w:r>
+        <w:rPr>
+          <w:rFonts w:eastAsia="SimSun"/>
+          <w:lang w:val="en-US"/>
+        </w:rPr>
+        <w:t xml:space="preserve">def </w:t>
+      </w:r>
+      <w:proofErr w:type="spellStart"/>
+      <w:r>
+        <w:rPr>
+          <w:rFonts w:eastAsia="SimSun"/>
+          <w:lang w:val="en-US"/>
+        </w:rPr>
+        <w:t>log_performance_</w:t>
+      </w:r>
+      <w:proofErr w:type="gramStart"/>
+      <w:r>
+        <w:rPr>
+          <w:rFonts w:eastAsia="SimSun"/>
+          <w:lang w:val="en-US"/>
+        </w:rPr>
+        <w:t>metrics</w:t>
+      </w:r>
+      <w:proofErr w:type="spellEnd"/>
+      <w:r>
+        <w:rPr>
+          <w:rFonts w:eastAsia="SimSun"/>
+          <w:lang w:val="en-US"/>
+        </w:rPr>
+        <w:t>(</w:t>
+      </w:r>
+      <w:proofErr w:type="gramEnd"/>
+      <w:r>
+        <w:rPr>
+          <w:rFonts w:eastAsia="SimSun"/>
+          <w:lang w:val="en-US"/>
+        </w:rPr>
+        <w:t xml:space="preserve">self, </w:t>
+      </w:r>
+      <w:proofErr w:type="spellStart"/>
+      <w:r>
+        <w:rPr>
+          <w:rFonts w:eastAsia="SimSun"/>
+          <w:lang w:val="en-US"/>
+        </w:rPr>
+        <w:t>metrics_data</w:t>
+      </w:r>
+      <w:proofErr w:type="spellEnd"/>
+      <w:r>
+        <w:rPr>
+          <w:rFonts w:eastAsia="SimSun"/>
+          <w:lang w:val="en-US"/>
+        </w:rPr>
+        <w:t>):</w:t>
+      </w:r>
+    </w:p>
+    <w:p>
+      <w:pPr>
+        <w:rPr>
+          <w:rFonts w:eastAsia="SimSun"/>
+          <w:lang w:val="en-US"/>
+        </w:rPr>
+      </w:pPr>
+      <w:r>
+        <w:rPr>
+          <w:rFonts w:eastAsia="SimSun"/>
+          <w:lang w:val="en-US"/>
+        </w:rPr>
+        <w:t xml:space="preserve">    """</w:t>
+      </w:r>
+      <w:r>
+        <w:rPr>
+          <w:rFonts w:eastAsia="SimSun" w:hint="eastAsia"/>
+          <w:lang w:val="en-US"/>
+        </w:rPr>
+        <w:t>记录性能指标（首字响应时间、完整响应时间等）</w:t>
+      </w:r>
+      <w:r>
+        <w:rPr>
+          <w:rFonts w:eastAsia="SimSun"/>
+          <w:lang w:val="en-US"/>
+        </w:rPr>
+        <w:t>"""</w:t>
+      </w:r>
+    </w:p>
+    <w:p>
+      <w:pPr>
+        <w:rPr>
+          <w:rFonts w:eastAsia="SimSun"/>
+          <w:lang w:val="en-US"/>
+        </w:rPr>
+      </w:pPr>
+      <w:r>
+        <w:rPr>
+          <w:rFonts w:eastAsia="SimSun" w:hint="eastAsia"/>
+          <w:lang w:val="en-US"/>
+        </w:rPr>
+        <w:t>记录的指标：</w:t>
+      </w:r>
+    </w:p>
+    <w:p>
+      <w:pPr>
+        <w:rPr>
+          <w:rFonts w:eastAsia="SimSun"/>
+          <w:lang w:val="en-US"/>
+        </w:rPr>
+      </w:pPr>
+    </w:p>
+    <w:p>
+      <w:pPr>
+        <w:rPr>
+          <w:rFonts w:eastAsia="SimSun"/>
+          <w:lang w:val="en-US"/>
+        </w:rPr>
+      </w:pPr>
+      <w:proofErr w:type="spellStart"/>
+      <w:r>
+        <w:rPr>
+          <w:rFonts w:eastAsia="SimSun"/>
+          <w:lang w:val="en-US"/>
+        </w:rPr>
+        <w:t>request_type</w:t>
+      </w:r>
+      <w:proofErr w:type="spellEnd"/>
+      <w:r>
+        <w:rPr>
+          <w:rFonts w:eastAsia="SimSun"/>
+          <w:lang w:val="en-US"/>
+        </w:rPr>
+        <w:t xml:space="preserve">: "stream" </w:t>
+      </w:r>
+      <w:r>
+        <w:rPr>
+          <w:rFonts w:eastAsia="SimSun" w:hint="eastAsia"/>
+          <w:lang w:val="en-US"/>
+        </w:rPr>
+        <w:t>或</w:t>
+      </w:r>
+      <w:r>
+        <w:rPr>
+          <w:rFonts w:eastAsia="SimSun"/>
+          <w:lang w:val="en-US"/>
+        </w:rPr>
+        <w:t xml:space="preserve"> "non-stream"</w:t>
+      </w:r>
+    </w:p>
+    <w:p>
+      <w:pPr>
+        <w:rPr>
+          <w:rFonts w:eastAsia="SimSun"/>
+          <w:lang w:val="en-US"/>
+        </w:rPr>
+      </w:pPr>
+      <w:proofErr w:type="spellStart"/>
+      <w:r>
+        <w:rPr>
+          <w:rFonts w:eastAsia="SimSun"/>
+          <w:lang w:val="en-US"/>
+        </w:rPr>
+        <w:t>first_token_time_ms</w:t>
+      </w:r>
+      <w:proofErr w:type="spellEnd"/>
+      <w:r>
+        <w:rPr>
+          <w:rFonts w:eastAsia="SimSun"/>
+          <w:lang w:val="en-US"/>
+        </w:rPr>
+        <w:t xml:space="preserve">: </w:t>
+      </w:r>
+      <w:r>
+        <w:rPr>
+          <w:rFonts w:eastAsia="SimSun" w:hint="eastAsia"/>
+          <w:lang w:val="en-US"/>
+        </w:rPr>
+        <w:t>首字响应时间（毫秒）</w:t>
+      </w:r>
+    </w:p>
+    <w:p>
+      <w:pPr>
+        <w:rPr>
+          <w:rFonts w:eastAsia="SimSun"/>
+          <w:lang w:val="en-US"/>
+        </w:rPr>
+      </w:pPr>
+      <w:proofErr w:type="spellStart"/>
+      <w:r>
+        <w:rPr>
+          <w:rFonts w:eastAsia="SimSun"/>
+          <w:lang w:val="en-US"/>
+        </w:rPr>
+        <w:t>completion_time_ms</w:t>
+      </w:r>
+      <w:proofErr w:type="spellEnd"/>
+      <w:r>
+        <w:rPr>
+          <w:rFonts w:eastAsia="SimSun"/>
+          <w:lang w:val="en-US"/>
+        </w:rPr>
+        <w:t xml:space="preserve">: </w:t>
+      </w:r>
+      <w:r>
+        <w:rPr>
+          <w:rFonts w:eastAsia="SimSun" w:hint="eastAsia"/>
+          <w:lang w:val="en-US"/>
+        </w:rPr>
+        <w:t>完整响应时间（毫秒）</w:t>
+      </w:r>
+    </w:p>
+    <w:p>
+      <w:pPr>
+        <w:rPr>
+          <w:rFonts w:eastAsia="SimSun"/>
+          <w:lang w:val="en-US"/>
+        </w:rPr>
+      </w:pPr>
+      <w:proofErr w:type="spellStart"/>
+      <w:r>
+        <w:rPr>
+          <w:rFonts w:eastAsia="SimSun"/>
+          <w:lang w:val="en-US"/>
+        </w:rPr>
+        <w:t>response_length</w:t>
+      </w:r>
+      <w:proofErr w:type="spellEnd"/>
+      <w:r>
+        <w:rPr>
+          <w:rFonts w:eastAsia="SimSun"/>
+          <w:lang w:val="en-US"/>
+        </w:rPr>
+        <w:t xml:space="preserve">: </w:t>
+      </w:r>
+      <w:r>
+        <w:rPr>
+          <w:rFonts w:eastAsia="SimSun" w:hint="eastAsia"/>
+          <w:lang w:val="en-US"/>
+        </w:rPr>
+        <w:t>响应字符数</w:t>
+      </w:r>
+    </w:p>
+    <w:p>
+      <w:pPr>
+        <w:rPr>
+          <w:rFonts w:eastAsia="SimSun"/>
+          <w:i/>
+          <w:iCs/>
+          <w:lang w:val="en-US"/>
+        </w:rPr>
+      </w:pPr>
+      <w:r>
+        <w:rPr>
+          <w:rFonts w:eastAsia="SimSun"/>
+          <w:lang w:val="en-US"/>
+        </w:rPr>
+        <w:t xml:space="preserve">question: </w:t>
+      </w:r>
+      <w:r>
+        <w:rPr>
+          <w:rFonts w:eastAsia="SimSun" w:hint="eastAsia"/>
+          <w:lang w:val="en-US"/>
+        </w:rPr>
+        <w:t>用户问题（前</w:t>
+      </w:r>
+      <w:r>
+        <w:rPr>
+          <w:rFonts w:eastAsia="SimSun"/>
+          <w:lang w:val="en-US"/>
+        </w:rPr>
+        <w:t>100</w:t>
+      </w:r>
+      <w:r>
+        <w:rPr>
+          <w:rFonts w:eastAsia="SimSun" w:hint="eastAsia"/>
+          <w:lang w:val="en-US"/>
+        </w:rPr>
+        <w:t>字符）</w:t>
+      </w:r>
+      <w:r>
+        <w:rPr>
+          <w:rFonts w:eastAsia="SimSun" w:hint="eastAsia"/>
+          <w:i/>
+          <w:iCs/>
           <w:lang w:val="en-US"/>
         </w:rPr>
         <w:br w:type="page"/>
@@ -12998,13 +16783,7 @@
         </w:r>
       </w:hyperlink>
     </w:p>
-    <w:p>
-      <w:pPr>
-        <w:rPr>
-          <w:rFonts w:hint="eastAsia"/>
-        </w:rPr>
-      </w:pPr>
-    </w:p>
+    <w:p/>
     <w:p>
       <w:pPr>
         <w:rPr>
@@ -13052,7 +16831,7 @@
     <w:p>
       <w:pPr>
         <w:rPr>
-          <w:rFonts w:eastAsia="SimSun" w:hint="eastAsia"/>
+          <w:rFonts w:eastAsia="SimSun"/>
           <w:lang w:val="en-US"/>
         </w:rPr>
       </w:pPr>
@@ -13189,7 +16968,7 @@
     <w:p>
       <w:pPr>
         <w:rPr>
-          <w:rFonts w:eastAsia="SimSun" w:hint="eastAsia"/>
+          <w:rFonts w:eastAsia="SimSun"/>
           <w:lang w:val="en-US"/>
         </w:rPr>
       </w:pPr>

</xml_diff>